<commit_message>
Updated documentation a lot
</commit_message>
<xml_diff>
--- a/Documentation~/TitanTool Documentation.docx
+++ b/Documentation~/TitanTool Documentation.docx
@@ -59,7 +59,7 @@
         <w:rPr>
           <w:rFonts w:ascii="Futura Book" w:hAnsi="Futura Book"/>
         </w:rPr>
-        <w:t>TitanTool is a Unity visual boss behavior graph tool that allows designers to create, validate, compile, and debug boss AI without writing code. It is demonstrated through a 2D boss fight prototype.</w:t>
+        <w:t>TitanTool is a Unity editor tool for designing boss behaviour as a visual graph. Designers can build attacks, phases, movement, conditions, and timing without hard-coding every decision. The graph is validated in the editor, compiled into runtime data, and then executed in play mode by the boss controller.</w:t>
       </w:r>
     </w:p>
     <w:p>
@@ -93,7 +93,7 @@
         <w:rPr>
           <w:rFonts w:ascii="Futura Book" w:hAnsi="Futura Book"/>
         </w:rPr>
-        <w:t xml:space="preserve">Visual boss behavior editor using Unity GraphToolkit </w:t>
+        <w:t>Graph-based boss authoring built with Unity GraphToolkit</w:t>
       </w:r>
     </w:p>
     <w:p>
@@ -110,21 +110,7 @@
         <w:rPr>
           <w:rFonts w:ascii="Futura Book" w:hAnsi="Futura Book"/>
         </w:rPr>
-        <w:t xml:space="preserve">Runtime behavior-tree execution through compiled </w:t>
-      </w:r>
-      <w:r>
-        <w:rPr>
-          <w:rFonts w:ascii="Futura Book" w:hAnsi="Futura Book"/>
-          <w:b/>
-          <w:bCs/>
-        </w:rPr>
-        <w:t>BossGraphAsset</w:t>
-      </w:r>
-      <w:r>
-        <w:rPr>
-          <w:rFonts w:ascii="Futura Book" w:hAnsi="Futura Book"/>
-        </w:rPr>
-        <w:t xml:space="preserve"> assets </w:t>
+        <w:t>Compiled runtime execution through BossGraphAsset assets</w:t>
       </w:r>
     </w:p>
     <w:p>
@@ -141,7 +127,7 @@
         <w:rPr>
           <w:rFonts w:ascii="Futura Book" w:hAnsi="Futura Book"/>
         </w:rPr>
-        <w:t xml:space="preserve">Shared blackboard variables for boss state and gameplay data </w:t>
+        <w:t>Shared Blackboard data for boss state, player references, health, and reusable gameplay values</w:t>
       </w:r>
     </w:p>
     <w:p>
@@ -158,61 +144,52 @@
         <w:rPr>
           <w:rFonts w:ascii="Futura Book" w:hAnsi="Futura Book"/>
         </w:rPr>
-        <w:t>2D prototype including player movement, shooting, bullets, prefabs, and URP</w:t>
-      </w:r>
-      <w:r>
-        <w:rPr>
-          <w:rFonts w:ascii="Futura Book" w:hAnsi="Futura Book"/>
-        </w:rPr>
-        <w:t>2D</w:t>
-      </w:r>
-    </w:p>
-    <w:p>
-      <w:pPr>
-        <w:rPr>
-          <w:rFonts w:ascii="Futura Book" w:hAnsi="Futura Book"/>
-        </w:rPr>
-      </w:pPr>
-    </w:p>
-    <w:p>
-      <w:pPr>
-        <w:rPr>
-          <w:rFonts w:ascii="Futura Book" w:hAnsi="Futura Book"/>
-        </w:rPr>
-      </w:pPr>
-    </w:p>
-    <w:p>
-      <w:pPr>
-        <w:rPr>
-          <w:rFonts w:ascii="Futura Book" w:hAnsi="Futura Book"/>
-        </w:rPr>
-      </w:pPr>
-      <w:r>
-        <w:rPr>
-          <w:rFonts w:ascii="Futura Book" w:hAnsi="Futura Book"/>
-        </w:rPr>
-        <w:t>How titan tool works</w:t>
+        <w:t>2D boss-fight prototype with movement, shooting, bullets, prefabs, target points, and URP 2D</w:t>
+      </w:r>
+    </w:p>
+    <w:p>
+      <w:pPr>
+        <w:rPr>
+          <w:rFonts w:ascii="Futura Book" w:hAnsi="Futura Book"/>
+        </w:rPr>
+      </w:pPr>
+    </w:p>
+    <w:p>
+      <w:pPr>
+        <w:rPr>
+          <w:rFonts w:ascii="Futura Book" w:hAnsi="Futura Book"/>
+        </w:rPr>
+      </w:pPr>
+    </w:p>
+    <w:p>
+      <w:pPr>
+        <w:rPr>
+          <w:rFonts w:ascii="Futura Book" w:hAnsi="Futura Book"/>
+        </w:rPr>
+      </w:pPr>
+      <w:r>
+        <w:rPr>
+          <w:rFonts w:ascii="Futura Book" w:hAnsi="Futura Book"/>
+        </w:rPr>
+        <w:t>How TitanTool Works - Setup - Node Overview - Keyboard Shortcuts</w:t>
       </w:r>
       <w:r>
         <w:rPr>
           <w:rFonts w:ascii="Futura Book" w:hAnsi="Futura Book"/>
         </w:rPr>
         <w:br/>
-        <w:t>Setup</w:t>
       </w:r>
       <w:r>
         <w:rPr>
           <w:rFonts w:ascii="Futura Book" w:hAnsi="Futura Book"/>
         </w:rPr>
         <w:br/>
-        <w:t>Different Nodes</w:t>
       </w:r>
       <w:r>
         <w:rPr>
           <w:rFonts w:ascii="Futura Book" w:hAnsi="Futura Book"/>
         </w:rPr>
         <w:br/>
-        <w:t>Keyboard shortcuts</w:t>
       </w:r>
     </w:p>
     <w:p>
@@ -299,84 +276,13 @@
           <w:bCs/>
         </w:rPr>
       </w:pPr>
-    </w:p>
-    <w:p>
-      <w:pPr>
-        <w:rPr>
-          <w:rFonts w:ascii="Futura Book" w:hAnsi="Futura Book"/>
-          <w:b/>
-          <w:bCs/>
-        </w:rPr>
-      </w:pPr>
-    </w:p>
-    <w:p>
-      <w:pPr>
-        <w:rPr>
-          <w:rFonts w:ascii="Futura Book" w:hAnsi="Futura Book"/>
-          <w:b/>
-          <w:bCs/>
-        </w:rPr>
-      </w:pPr>
-    </w:p>
-    <w:p>
-      <w:pPr>
-        <w:rPr>
-          <w:rFonts w:ascii="Futura Book" w:hAnsi="Futura Book"/>
-          <w:b/>
-          <w:bCs/>
-        </w:rPr>
-      </w:pPr>
-    </w:p>
-    <w:p>
-      <w:pPr>
-        <w:rPr>
-          <w:rFonts w:ascii="Futura Book" w:hAnsi="Futura Book"/>
-          <w:b/>
-          <w:bCs/>
-        </w:rPr>
-      </w:pPr>
-    </w:p>
-    <w:p>
-      <w:pPr>
-        <w:rPr>
-          <w:rFonts w:ascii="Futura Book" w:hAnsi="Futura Book"/>
-          <w:b/>
-          <w:bCs/>
-        </w:rPr>
-      </w:pPr>
-    </w:p>
-    <w:p>
-      <w:pPr>
-        <w:rPr>
-          <w:rFonts w:ascii="Futura Book" w:hAnsi="Futura Book"/>
-          <w:b/>
-          <w:bCs/>
-        </w:rPr>
-      </w:pPr>
-    </w:p>
-    <w:p>
-      <w:pPr>
-        <w:rPr>
-          <w:rFonts w:ascii="Futura Book" w:hAnsi="Futura Book"/>
-          <w:b/>
-          <w:bCs/>
-        </w:rPr>
-      </w:pPr>
-    </w:p>
-    <w:p>
-      <w:pPr>
-        <w:rPr>
-          <w:rFonts w:ascii="Futura Book" w:hAnsi="Futura Book"/>
-          <w:b/>
-          <w:bCs/>
-        </w:rPr>
-      </w:pPr>
-      <w:r>
-        <w:rPr>
-          <w:rFonts w:ascii="Futura Book" w:hAnsi="Futura Book"/>
-          <w:b/>
-          <w:bCs/>
-        </w:rPr>
+      <w:r>
+        <w:rPr>
+          <w:rFonts w:ascii="Futura Book" w:hAnsi="Futura Book"/>
+          <w:b/>
+          <w:bCs/>
+        </w:rPr>
+        <w:lastRenderedPageBreak/>
         <w:t>How TitanTool Works</w:t>
       </w:r>
     </w:p>
@@ -390,47 +296,33 @@
         <w:rPr>
           <w:rFonts w:ascii="Futura Book" w:hAnsi="Futura Book"/>
         </w:rPr>
-        <w:t>A TitanTool graph is a visual behavior plan for a boss.</w:t>
-      </w:r>
-    </w:p>
-    <w:p>
-      <w:pPr>
-        <w:rPr>
-          <w:rFonts w:ascii="Futura Book" w:hAnsi="Futura Book"/>
-        </w:rPr>
-      </w:pPr>
-      <w:r>
-        <w:rPr>
-          <w:rFonts w:ascii="Futura Book" w:hAnsi="Futura Book"/>
-        </w:rPr>
-        <w:t xml:space="preserve">Execution always starts at the </w:t>
-      </w:r>
-      <w:r>
-        <w:rPr>
-          <w:rFonts w:ascii="Futura Book" w:hAnsi="Futura Book"/>
-          <w:b/>
-          <w:bCs/>
-        </w:rPr>
-        <w:t>Start Node</w:t>
-      </w:r>
-      <w:r>
-        <w:rPr>
-          <w:rFonts w:ascii="Futura Book" w:hAnsi="Futura Book"/>
-        </w:rPr>
-        <w:t>, then follows graph connections through nodes that decide, move, wait, attack, spawn objects, or check conditions.</w:t>
-      </w:r>
-    </w:p>
-    <w:p>
-      <w:pPr>
-        <w:rPr>
-          <w:rFonts w:ascii="Futura Book" w:hAnsi="Futura Book"/>
-        </w:rPr>
-      </w:pPr>
-      <w:r>
-        <w:rPr>
-          <w:rFonts w:ascii="Futura Book" w:hAnsi="Futura Book"/>
-        </w:rPr>
-        <w:t>Most nodes belong to one of these categories:</w:t>
+        <w:t>A TitanTool graph is the visual plan for a boss encounter. It describes what the boss can do, when those actions are allowed, and how each action connects to the next.</w:t>
+      </w:r>
+    </w:p>
+    <w:p>
+      <w:pPr>
+        <w:rPr>
+          <w:rFonts w:ascii="Futura Book" w:hAnsi="Futura Book"/>
+        </w:rPr>
+      </w:pPr>
+      <w:r>
+        <w:rPr>
+          <w:rFonts w:ascii="Futura Book" w:hAnsi="Futura Book"/>
+        </w:rPr>
+        <w:t>Execution starts at the Start node. From there, the graph follows connections through flow, composite, condition, action, and Blackboard nodes.</w:t>
+      </w:r>
+    </w:p>
+    <w:p>
+      <w:pPr>
+        <w:rPr>
+          <w:rFonts w:ascii="Futura Book" w:hAnsi="Futura Book"/>
+        </w:rPr>
+      </w:pPr>
+      <w:r>
+        <w:rPr>
+          <w:rFonts w:ascii="Futura Book" w:hAnsi="Futura Book"/>
+        </w:rPr>
+        <w:t>The node roles are:</w:t>
       </w:r>
     </w:p>
     <w:p>
@@ -449,13 +341,7 @@
           <w:b/>
           <w:bCs/>
         </w:rPr>
-        <w:t>Flow Nodes</w:t>
-      </w:r>
-      <w:r>
-        <w:rPr>
-          <w:rFonts w:ascii="Futura Book" w:hAnsi="Futura Book"/>
-        </w:rPr>
-        <w:t xml:space="preserve"> – Define execution flow. </w:t>
+        <w:t>Flow Nodes - Define where execution begins and how flow continues.</w:t>
       </w:r>
     </w:p>
     <w:p>
@@ -474,13 +360,7 @@
           <w:b/>
           <w:bCs/>
         </w:rPr>
-        <w:t>Composite Nodes</w:t>
-      </w:r>
-      <w:r>
-        <w:rPr>
-          <w:rFonts w:ascii="Futura Book" w:hAnsi="Futura Book"/>
-        </w:rPr>
-        <w:t xml:space="preserve"> – Control which child nodes execute. </w:t>
+        <w:t>Composite Nodes - Choose which child nodes run, and in what order.</w:t>
       </w:r>
     </w:p>
     <w:p>
@@ -499,13 +379,7 @@
           <w:b/>
           <w:bCs/>
         </w:rPr>
-        <w:t>Decorator Nodes</w:t>
-      </w:r>
-      <w:r>
-        <w:rPr>
-          <w:rFonts w:ascii="Futura Book" w:hAnsi="Futura Book"/>
-        </w:rPr>
-        <w:t xml:space="preserve"> – Modify the execution of a child. </w:t>
+        <w:t>Decorator Nodes - Modify when or how a child node is allowed to execute.</w:t>
       </w:r>
     </w:p>
     <w:p>
@@ -524,13 +398,7 @@
           <w:b/>
           <w:bCs/>
         </w:rPr>
-        <w:t>Condition Nodes</w:t>
-      </w:r>
-      <w:r>
-        <w:rPr>
-          <w:rFonts w:ascii="Futura Book" w:hAnsi="Futura Book"/>
-        </w:rPr>
-        <w:t xml:space="preserve"> – Check whether something is true. </w:t>
+        <w:t>Condition Nodes - Check gameplay rules, such as health ranges or Blackboard values.</w:t>
       </w:r>
     </w:p>
     <w:p>
@@ -549,13 +417,7 @@
           <w:b/>
           <w:bCs/>
         </w:rPr>
-        <w:t>Action Nodes</w:t>
-      </w:r>
-      <w:r>
-        <w:rPr>
-          <w:rFonts w:ascii="Futura Book" w:hAnsi="Futura Book"/>
-        </w:rPr>
-        <w:t xml:space="preserve"> – Perform gameplay actions. </w:t>
+        <w:t>Action Nodes - Perform visible gameplay behaviour, such as moving, shooting, spawning, throwing, animating, or changing sprites.</w:t>
       </w:r>
     </w:p>
     <w:p>
@@ -574,13 +436,7 @@
           <w:b/>
           <w:bCs/>
         </w:rPr>
-        <w:t>Blackboard Nodes</w:t>
-      </w:r>
-      <w:r>
-        <w:rPr>
-          <w:rFonts w:ascii="Futura Book" w:hAnsi="Futura Book"/>
-        </w:rPr>
-        <w:t xml:space="preserve"> – Read or modify shared variables. </w:t>
+        <w:t>Blackboard Nodes - Read or change shared data so nodes can communicate without directly depending on each other.</w:t>
       </w:r>
     </w:p>
     <w:p>
@@ -599,26 +455,20 @@
           <w:b/>
           <w:bCs/>
         </w:rPr>
-        <w:t>Utility Nodes</w:t>
-      </w:r>
-      <w:r>
-        <w:rPr>
-          <w:rFonts w:ascii="Futura Book" w:hAnsi="Futura Book"/>
-        </w:rPr>
-        <w:t xml:space="preserve"> – Improve graph readability. </w:t>
-      </w:r>
-    </w:p>
-    <w:p>
-      <w:pPr>
-        <w:rPr>
-          <w:rFonts w:ascii="Futura Book" w:hAnsi="Futura Book"/>
-        </w:rPr>
-      </w:pPr>
-      <w:r>
-        <w:rPr>
-          <w:rFonts w:ascii="Futura Book" w:hAnsi="Futura Book"/>
-        </w:rPr>
-        <w:t>The core idea is simple:</w:t>
+        <w:t>Utility Nodes - Improve graph readability and keep large graphs easier to organize.</w:t>
+      </w:r>
+    </w:p>
+    <w:p>
+      <w:pPr>
+        <w:rPr>
+          <w:rFonts w:ascii="Futura Book" w:hAnsi="Futura Book"/>
+        </w:rPr>
+      </w:pPr>
+      <w:r>
+        <w:rPr>
+          <w:rFonts w:ascii="Futura Book" w:hAnsi="Futura Book"/>
+        </w:rPr>
+        <w:t>The main idea:</w:t>
       </w:r>
     </w:p>
     <w:p>
@@ -637,13 +487,7 @@
           <w:b/>
           <w:bCs/>
         </w:rPr>
-        <w:t>Composites</w:t>
-      </w:r>
-      <w:r>
-        <w:rPr>
-          <w:rFonts w:ascii="Futura Book" w:hAnsi="Futura Book"/>
-        </w:rPr>
-        <w:t xml:space="preserve"> organize behavior. </w:t>
+        <w:t>Composites structure the behaviour.</w:t>
       </w:r>
     </w:p>
     <w:p>
@@ -662,13 +506,7 @@
           <w:b/>
           <w:bCs/>
         </w:rPr>
-        <w:t>Conditions</w:t>
-      </w:r>
-      <w:r>
-        <w:rPr>
-          <w:rFonts w:ascii="Futura Book" w:hAnsi="Futura Book"/>
-        </w:rPr>
-        <w:t xml:space="preserve"> decide what can happen. </w:t>
+        <w:t>Conditions decide which behaviour is allowed to run.</w:t>
       </w:r>
     </w:p>
     <w:p>
@@ -687,13 +525,7 @@
           <w:b/>
           <w:bCs/>
         </w:rPr>
-        <w:t>Actions</w:t>
-      </w:r>
-      <w:r>
-        <w:rPr>
-          <w:rFonts w:ascii="Futura Book" w:hAnsi="Futura Book"/>
-        </w:rPr>
-        <w:t xml:space="preserve"> perform the visible gameplay. </w:t>
+        <w:t>Actions create the visible gameplay result.</w:t>
       </w:r>
     </w:p>
     <w:p>
@@ -712,13 +544,7 @@
           <w:b/>
           <w:bCs/>
         </w:rPr>
-        <w:t>Blackboard variables</w:t>
-      </w:r>
-      <w:r>
-        <w:rPr>
-          <w:rFonts w:ascii="Futura Book" w:hAnsi="Futura Book"/>
-        </w:rPr>
-        <w:t xml:space="preserve"> allow nodes to share information.</w:t>
+        <w:t>Blackboard values let separate nodes share state safely.</w:t>
       </w:r>
     </w:p>
     <w:p>
@@ -796,44 +622,17 @@
       <w:pPr>
         <w:rPr>
           <w:rFonts w:ascii="Futura Book" w:hAnsi="Futura Book"/>
-        </w:rPr>
-      </w:pPr>
-    </w:p>
-    <w:p>
-      <w:pPr>
-        <w:rPr>
-          <w:rFonts w:ascii="Futura Book" w:hAnsi="Futura Book"/>
-        </w:rPr>
-      </w:pPr>
-    </w:p>
-    <w:p>
-      <w:pPr>
-        <w:rPr>
-          <w:rFonts w:ascii="Futura Book" w:hAnsi="Futura Book"/>
-        </w:rPr>
-      </w:pPr>
-    </w:p>
-    <w:p>
-      <w:pPr>
-        <w:rPr>
-          <w:rFonts w:ascii="Futura Book" w:hAnsi="Futura Book"/>
-        </w:rPr>
-      </w:pPr>
-    </w:p>
-    <w:p>
-      <w:pPr>
-        <w:rPr>
-          <w:rFonts w:ascii="Futura Book" w:hAnsi="Futura Book"/>
-          <w:b/>
-          <w:bCs/>
-        </w:rPr>
-      </w:pPr>
-      <w:r>
-        <w:rPr>
-          <w:rFonts w:ascii="Futura Book" w:hAnsi="Futura Book"/>
-          <w:b/>
-          <w:bCs/>
-        </w:rPr>
+          <w:b/>
+          <w:bCs/>
+        </w:rPr>
+      </w:pPr>
+      <w:r>
+        <w:rPr>
+          <w:rFonts w:ascii="Futura Book" w:hAnsi="Futura Book"/>
+          <w:b/>
+          <w:bCs/>
+        </w:rPr>
+        <w:lastRenderedPageBreak/>
         <w:t>Setup</w:t>
       </w:r>
     </w:p>
@@ -851,35 +650,7 @@
           <w:b/>
           <w:bCs/>
         </w:rPr>
-        <w:t>1. Configure the Boss</w:t>
-      </w:r>
-      <w:r>
-        <w:rPr>
-          <w:rFonts w:ascii="Futura Book" w:hAnsi="Futura Book"/>
-          <w:b/>
-          <w:bCs/>
-        </w:rPr>
-        <w:br/>
-      </w:r>
-      <w:r>
-        <w:rPr>
-          <w:rFonts w:ascii="Futura Book" w:hAnsi="Futura Book"/>
-        </w:rPr>
-        <w:t xml:space="preserve">Add a </w:t>
-      </w:r>
-      <w:r>
-        <w:rPr>
-          <w:rFonts w:ascii="Futura Book" w:hAnsi="Futura Book"/>
-          <w:b/>
-          <w:bCs/>
-        </w:rPr>
-        <w:t>Boss Director</w:t>
-      </w:r>
-      <w:r>
-        <w:rPr>
-          <w:rFonts w:ascii="Futura Book" w:hAnsi="Futura Book"/>
-        </w:rPr>
-        <w:t xml:space="preserve"> component to the boss and assign:</w:t>
+        <w:t>1. Configure the Boss - Add a Boss Director component to the boss and assign the required scene references:</w:t>
       </w:r>
     </w:p>
     <w:p>
@@ -943,27 +714,7 @@
         <w:rPr>
           <w:rFonts w:ascii="Futura Book" w:hAnsi="Futura Book"/>
         </w:rPr>
-        <w:t xml:space="preserve">Also add a </w:t>
-      </w:r>
-      <w:r>
-        <w:rPr>
-          <w:rFonts w:ascii="Futura Book" w:hAnsi="Futura Book"/>
-          <w:b/>
-          <w:bCs/>
-        </w:rPr>
-        <w:t>Boss Health</w:t>
-      </w:r>
-      <w:r>
-        <w:rPr>
-          <w:rFonts w:ascii="Futura Book" w:hAnsi="Futura Book"/>
-        </w:rPr>
-        <w:t xml:space="preserve"> component and configure its health values. Phase nodes use this component during graph executio</w:t>
-      </w:r>
-      <w:r>
-        <w:rPr>
-          <w:rFonts w:ascii="Futura Book" w:hAnsi="Futura Book"/>
-        </w:rPr>
-        <w:t>n.</w:t>
+        <w:t>Add a Boss Health component and configure its health values. Phase nodes use this health data while the graph is running.</w:t>
       </w:r>
       <w:r>
         <w:rPr>
@@ -988,21 +739,7 @@
           <w:b/>
           <w:bCs/>
         </w:rPr>
-        <w:t>2. Create Target Points</w:t>
-      </w:r>
-      <w:r>
-        <w:rPr>
-          <w:rFonts w:ascii="Futura Book" w:hAnsi="Futura Book"/>
-          <w:b/>
-          <w:bCs/>
-        </w:rPr>
-        <w:br/>
-      </w:r>
-      <w:r>
-        <w:rPr>
-          <w:rFonts w:ascii="Futura Book" w:hAnsi="Futura Book"/>
-        </w:rPr>
-        <w:t>Target points define reusable positions for movement, spawning, and teleporting.</w:t>
+        <w:t>2. Create Target Points - Target points define reusable scene positions for movement, spawning, throwing, and teleporting.</w:t>
       </w:r>
     </w:p>
     <w:p>
@@ -1019,7 +756,7 @@
         <w:rPr>
           <w:rFonts w:ascii="Futura Book" w:hAnsi="Futura Book"/>
         </w:rPr>
-        <w:t xml:space="preserve">Place Target Transforms in the scene. </w:t>
+        <w:t>Place TargetPoint objects in the scene.</w:t>
       </w:r>
     </w:p>
     <w:p>
@@ -1036,21 +773,7 @@
         <w:rPr>
           <w:rFonts w:ascii="Futura Book" w:hAnsi="Futura Book"/>
         </w:rPr>
-        <w:t xml:space="preserve">Press </w:t>
-      </w:r>
-      <w:r>
-        <w:rPr>
-          <w:rFonts w:ascii="Futura Book" w:hAnsi="Futura Book"/>
-          <w:b/>
-          <w:bCs/>
-        </w:rPr>
-        <w:t>Use Scene Points</w:t>
-      </w:r>
-      <w:r>
-        <w:rPr>
-          <w:rFonts w:ascii="Futura Book" w:hAnsi="Futura Book"/>
-        </w:rPr>
-        <w:t xml:space="preserve"> on the Boss Director. </w:t>
+        <w:t>Press Use Scene Points on the Boss Director.</w:t>
       </w:r>
     </w:p>
     <w:p>
@@ -1067,34 +790,20 @@
         <w:rPr>
           <w:rFonts w:ascii="Futura Book" w:hAnsi="Futura Book"/>
         </w:rPr>
-        <w:t xml:space="preserve">Press </w:t>
-      </w:r>
-      <w:r>
-        <w:rPr>
-          <w:rFonts w:ascii="Futura Book" w:hAnsi="Futura Book"/>
-          <w:b/>
-          <w:bCs/>
-        </w:rPr>
-        <w:t>Create Missing Target Point Keys</w:t>
-      </w:r>
-      <w:r>
-        <w:rPr>
-          <w:rFonts w:ascii="Futura Book" w:hAnsi="Futura Book"/>
-        </w:rPr>
-        <w:t xml:space="preserve">. </w:t>
-      </w:r>
-    </w:p>
-    <w:p>
-      <w:pPr>
-        <w:rPr>
-          <w:rFonts w:ascii="Futura Book" w:hAnsi="Futura Book"/>
-        </w:rPr>
-      </w:pPr>
-      <w:r>
-        <w:rPr>
-          <w:rFonts w:ascii="Futura Book" w:hAnsi="Futura Book"/>
-        </w:rPr>
-        <w:t>TitanTool creates reusable Target Point assets inside:</w:t>
+        <w:t>Press Create Missing Target Point Keys.</w:t>
+      </w:r>
+    </w:p>
+    <w:p>
+      <w:pPr>
+        <w:rPr>
+          <w:rFonts w:ascii="Futura Book" w:hAnsi="Futura Book"/>
+        </w:rPr>
+      </w:pPr>
+      <w:r>
+        <w:rPr>
+          <w:rFonts w:ascii="Futura Book" w:hAnsi="Futura Book"/>
+        </w:rPr>
+        <w:t>TitanTool creates reusable TargetPointKey assets in Data/TitanTool/TargetPoints. These keys can be reused across movement, spawn, throw, and teleport nodes.</w:t>
       </w:r>
       <w:r>
         <w:rPr>
@@ -1106,19 +815,7 @@
         <w:rPr>
           <w:rFonts w:ascii="Futura Book" w:hAnsi="Futura Book"/>
         </w:rPr>
-        <w:t>Data/TitanTool/TargetPoints</w:t>
-      </w:r>
-      <w:r>
-        <w:rPr>
-          <w:rFonts w:ascii="Futura Book" w:hAnsi="Futura Book"/>
-        </w:rPr>
         <w:br/>
-      </w:r>
-      <w:r>
-        <w:rPr>
-          <w:rFonts w:ascii="Futura Book" w:hAnsi="Futura Book"/>
-        </w:rPr>
-        <w:t>These assets can now be referenced throughout the graph.</w:t>
       </w:r>
     </w:p>
     <w:p>
@@ -1150,35 +847,7 @@
           <w:b/>
           <w:bCs/>
         </w:rPr>
-        <w:t>3. Create a Graph</w:t>
-      </w:r>
-      <w:r>
-        <w:rPr>
-          <w:rFonts w:ascii="Futura Book" w:hAnsi="Futura Book"/>
-          <w:b/>
-          <w:bCs/>
-        </w:rPr>
-        <w:br/>
-      </w:r>
-      <w:r>
-        <w:rPr>
-          <w:rFonts w:ascii="Futura Book" w:hAnsi="Futura Book"/>
-        </w:rPr>
-        <w:t>Assign an existing graph to the Boss Director.</w:t>
-      </w:r>
-      <w:r>
-        <w:rPr>
-          <w:rFonts w:ascii="Futura Book" w:hAnsi="Futura Book"/>
-          <w:b/>
-          <w:bCs/>
-        </w:rPr>
-        <w:br/>
-      </w:r>
-      <w:r>
-        <w:rPr>
-          <w:rFonts w:ascii="Futura Book" w:hAnsi="Futura Book"/>
-        </w:rPr>
-        <w:t>If none exists:</w:t>
+        <w:t>3. Create a Graph - Assign an existing graph to the Boss Director. If no graph exists yet:</w:t>
       </w:r>
     </w:p>
     <w:p>
@@ -1195,34 +864,20 @@
         <w:rPr>
           <w:rFonts w:ascii="Futura Book" w:hAnsi="Futura Book"/>
         </w:rPr>
-        <w:t xml:space="preserve">Press </w:t>
-      </w:r>
-      <w:r>
-        <w:rPr>
-          <w:rFonts w:ascii="Futura Book" w:hAnsi="Futura Book"/>
-          <w:b/>
-          <w:bCs/>
-        </w:rPr>
-        <w:t>Make New Graph</w:t>
-      </w:r>
-      <w:r>
-        <w:rPr>
-          <w:rFonts w:ascii="Futura Book" w:hAnsi="Futura Book"/>
-        </w:rPr>
-        <w:t xml:space="preserve"> </w:t>
-      </w:r>
-    </w:p>
-    <w:p>
-      <w:pPr>
-        <w:rPr>
-          <w:rFonts w:ascii="Futura Book" w:hAnsi="Futura Book"/>
-        </w:rPr>
-      </w:pPr>
-      <w:r>
-        <w:rPr>
-          <w:rFonts w:ascii="Futura Book" w:hAnsi="Futura Book"/>
-        </w:rPr>
-        <w:t>A new graph asset is created under:</w:t>
+        <w:t>Press Make New Graph.</w:t>
+      </w:r>
+    </w:p>
+    <w:p>
+      <w:pPr>
+        <w:rPr>
+          <w:rFonts w:ascii="Futura Book" w:hAnsi="Futura Book"/>
+        </w:rPr>
+      </w:pPr>
+      <w:r>
+        <w:rPr>
+          <w:rFonts w:ascii="Futura Book" w:hAnsi="Futura Book"/>
+        </w:rPr>
+        <w:t>A new .titan graph is created under Data/TitanTool. Press Open Graph to start editing.</w:t>
       </w:r>
       <w:r>
         <w:rPr>
@@ -1234,33 +889,7 @@
         <w:rPr>
           <w:rFonts w:ascii="Futura Book" w:hAnsi="Futura Book"/>
         </w:rPr>
-        <w:t>Data/TitanTool/...</w:t>
-      </w:r>
-      <w:r>
-        <w:rPr>
-          <w:rFonts w:ascii="Futura Book" w:hAnsi="Futura Book"/>
-        </w:rPr>
         <w:br/>
-      </w:r>
-      <w:r>
-        <w:rPr>
-          <w:rFonts w:ascii="Futura Book" w:hAnsi="Futura Book"/>
-        </w:rPr>
-        <w:t xml:space="preserve">Finally press </w:t>
-      </w:r>
-      <w:r>
-        <w:rPr>
-          <w:rFonts w:ascii="Futura Book" w:hAnsi="Futura Book"/>
-          <w:b/>
-          <w:bCs/>
-        </w:rPr>
-        <w:t>Open Graph</w:t>
-      </w:r>
-      <w:r>
-        <w:rPr>
-          <w:rFonts w:ascii="Futura Book" w:hAnsi="Futura Book"/>
-        </w:rPr>
-        <w:t xml:space="preserve"> to begin editing.</w:t>
       </w:r>
     </w:p>
     <w:p>
@@ -1332,6 +961,7 @@
           <w:sz w:val="18"/>
           <w:szCs w:val="18"/>
         </w:rPr>
+        <w:lastRenderedPageBreak/>
         <w:drawing>
           <wp:anchor distT="0" distB="0" distL="114300" distR="114300" simplePos="0" relativeHeight="251685888" behindDoc="0" locked="0" layoutInCell="1" allowOverlap="1" wp14:anchorId="5F3DF218" wp14:editId="1C5BE036">
             <wp:simplePos x="0" y="0"/>
@@ -1447,7 +1077,7 @@
           <w:b/>
           <w:bCs/>
         </w:rPr>
-        <w:t>Start</w:t>
+        <w:t>Start - Entry point of the graph. Each graph should contain exactly one Start node.</w:t>
       </w:r>
       <w:r>
         <w:rPr>
@@ -1456,12 +1086,6 @@
           <w:bCs/>
         </w:rPr>
         <w:br/>
-      </w:r>
-      <w:r>
-        <w:rPr>
-          <w:rFonts w:ascii="Futura Book" w:hAnsi="Futura Book"/>
-        </w:rPr>
-        <w:t>Entry point of every graph. Every graph should have one Start node.</w:t>
       </w:r>
     </w:p>
     <w:p>
@@ -1570,7 +1194,7 @@
           <w:b/>
           <w:bCs/>
         </w:rPr>
-        <w:t>Sequence (Run In Order)</w:t>
+        <w:t>Sequence (Run In Order) - Runs child nodes from top to bottom and stops when one child fails.</w:t>
       </w:r>
       <w:r>
         <w:rPr>
@@ -1579,12 +1203,6 @@
           <w:bCs/>
         </w:rPr>
         <w:br/>
-      </w:r>
-      <w:r>
-        <w:rPr>
-          <w:rFonts w:ascii="Futura Book" w:hAnsi="Futura Book"/>
-        </w:rPr>
-        <w:t>Runs children from top to bottom. Stops when a child fails.</w:t>
       </w:r>
     </w:p>
     <w:p>
@@ -1727,7 +1345,7 @@
           <w:b/>
           <w:bCs/>
         </w:rPr>
-        <w:t>Selector</w:t>
+        <w:t>Selector - Runs child nodes until one succeeds. Useful for choosing phases, attacks, or fallback behaviour.</w:t>
       </w:r>
       <w:r>
         <w:rPr>
@@ -1736,12 +1354,6 @@
           <w:bCs/>
         </w:rPr>
         <w:br/>
-      </w:r>
-      <w:r>
-        <w:rPr>
-          <w:rFonts w:ascii="Futura Book" w:hAnsi="Futura Book"/>
-        </w:rPr>
-        <w:t>Runs children until one succeeds. Useful for choosing between phases or attacks.</w:t>
       </w:r>
     </w:p>
     <w:p>
@@ -1872,7 +1484,7 @@
           <w:b/>
           <w:bCs/>
         </w:rPr>
-        <w:t>Random Selector</w:t>
+        <w:t>Random Selector - Randomly chooses one child branch to run.</w:t>
       </w:r>
       <w:r>
         <w:rPr>
@@ -1881,18 +1493,6 @@
           <w:bCs/>
         </w:rPr>
         <w:br/>
-      </w:r>
-      <w:r>
-        <w:rPr>
-          <w:rFonts w:ascii="Futura Book" w:hAnsi="Futura Book"/>
-        </w:rPr>
-        <w:t>Randomly chooses one child</w:t>
-      </w:r>
-      <w:r>
-        <w:rPr>
-          <w:rFonts w:ascii="Futura Book" w:hAnsi="Futura Book"/>
-        </w:rPr>
-        <w:t xml:space="preserve"> to run.</w:t>
       </w:r>
       <w:r>
         <w:rPr>
@@ -2011,7 +1611,7 @@
           <w:b/>
           <w:bCs/>
         </w:rPr>
-        <w:t>Weighted Random</w:t>
+        <w:t>Weighted Random - Randomly chooses a child branch using weights, making some branches more likely. Weight: Float.</w:t>
       </w:r>
       <w:r>
         <w:rPr>
@@ -2025,42 +1625,17 @@
         <w:rPr>
           <w:rFonts w:ascii="Futura Book" w:hAnsi="Futura Book"/>
         </w:rPr>
-        <w:t>Randomly chooses a child using weights.</w:t>
-      </w:r>
-      <w:r>
-        <w:rPr>
-          <w:rFonts w:ascii="Futura Book" w:hAnsi="Futura Book"/>
-        </w:rPr>
-        <w:t xml:space="preserve"> </w:t>
-      </w:r>
-      <w:r>
-        <w:rPr>
-          <w:rFonts w:ascii="Futura Book" w:hAnsi="Futura Book"/>
-        </w:rPr>
         <w:br/>
       </w:r>
-      <w:r>
-        <w:rPr>
-          <w:rFonts w:ascii="Futura Book" w:hAnsi="Futura Book"/>
-          <w:b/>
-          <w:bCs/>
-        </w:rPr>
-        <w:t>Weight</w:t>
-      </w:r>
-      <w:r>
-        <w:rPr>
-          <w:rFonts w:ascii="Futura Book" w:hAnsi="Futura Book"/>
-        </w:rPr>
-        <w:t xml:space="preserve"> </w:t>
-      </w:r>
-      <w:r>
-        <w:rPr>
-          <w:rFonts w:ascii="Futura Book" w:hAnsi="Futura Book"/>
-          <w:i/>
-          <w:iCs/>
-        </w:rPr>
-        <w:t>(Float)</w:t>
-      </w:r>
+    </w:p>
+    <w:p>
+      <w:pPr>
+        <w:rPr>
+          <w:rFonts w:ascii="Futura Book" w:hAnsi="Futura Book"/>
+          <w:b/>
+          <w:bCs/>
+        </w:rPr>
+      </w:pPr>
       <w:r>
         <w:rPr>
           <w:rFonts w:ascii="Merriweather 18pt" w:hAnsi="Merriweather 18pt"/>
@@ -2070,44 +1645,14 @@
           <w:sz w:val="18"/>
           <w:szCs w:val="18"/>
         </w:rPr>
-        <w:t xml:space="preserve"> </w:t>
-      </w:r>
-    </w:p>
-    <w:p>
-      <w:pPr>
-        <w:rPr>
-          <w:rFonts w:ascii="Futura Book" w:hAnsi="Futura Book"/>
-          <w:b/>
-          <w:bCs/>
-        </w:rPr>
-      </w:pPr>
-    </w:p>
-    <w:p>
-      <w:pPr>
-        <w:rPr>
-          <w:rFonts w:ascii="Futura Book" w:hAnsi="Futura Book"/>
-          <w:b/>
-          <w:bCs/>
-        </w:rPr>
-      </w:pPr>
-      <w:r>
-        <w:rPr>
-          <w:rFonts w:ascii="Merriweather 18pt" w:hAnsi="Merriweather 18pt"/>
-          <w:b/>
-          <w:bCs/>
-          <w:noProof/>
-          <w:sz w:val="18"/>
-          <w:szCs w:val="18"/>
-        </w:rPr>
-        <w:lastRenderedPageBreak/>
         <w:drawing>
-          <wp:anchor distT="0" distB="0" distL="114300" distR="114300" simplePos="0" relativeHeight="251691008" behindDoc="0" locked="0" layoutInCell="1" allowOverlap="1" wp14:anchorId="367BA7DA" wp14:editId="5DD95E7A">
+          <wp:anchor distT="0" distB="0" distL="114300" distR="114300" simplePos="0" relativeHeight="251691008" behindDoc="0" locked="0" layoutInCell="1" allowOverlap="1" wp14:anchorId="367BA7DA" wp14:editId="2A9BDC45">
             <wp:simplePos x="0" y="0"/>
             <wp:positionH relativeFrom="margin">
-              <wp:align>left</wp:align>
+              <wp:posOffset>114300</wp:posOffset>
             </wp:positionH>
             <wp:positionV relativeFrom="paragraph">
-              <wp:posOffset>81447</wp:posOffset>
+              <wp:posOffset>113030</wp:posOffset>
             </wp:positionV>
             <wp:extent cx="1744980" cy="1441450"/>
             <wp:effectExtent l="133350" t="76200" r="83820" b="139700"/>
@@ -2199,15 +1744,24 @@
       <w:pPr>
         <w:rPr>
           <w:rFonts w:ascii="Futura Book" w:hAnsi="Futura Book"/>
-        </w:rPr>
-      </w:pPr>
-      <w:r>
-        <w:rPr>
-          <w:rFonts w:ascii="Futura Book" w:hAnsi="Futura Book"/>
-          <w:b/>
-          <w:bCs/>
-        </w:rPr>
-        <w:t>Parallel</w:t>
+          <w:b/>
+          <w:bCs/>
+        </w:rPr>
+      </w:pPr>
+    </w:p>
+    <w:p>
+      <w:pPr>
+        <w:rPr>
+          <w:rFonts w:ascii="Futura Book" w:hAnsi="Futura Book"/>
+        </w:rPr>
+      </w:pPr>
+      <w:r>
+        <w:rPr>
+          <w:rFonts w:ascii="Futura Book" w:hAnsi="Futura Book"/>
+          <w:b/>
+          <w:bCs/>
+        </w:rPr>
+        <w:t>Parallel - Runs multiple child nodes at the same time. Succeed When: All Children or Any Child. Fail When: All Children or Any Child.</w:t>
       </w:r>
       <w:r>
         <w:rPr>
@@ -2221,106 +1775,14 @@
         <w:rPr>
           <w:rFonts w:ascii="Futura Book" w:hAnsi="Futura Book"/>
         </w:rPr>
-        <w:t>Runs all children simultaneously.</w:t>
-      </w:r>
-      <w:r>
-        <w:rPr>
-          <w:rFonts w:ascii="Futura Book" w:hAnsi="Futura Book"/>
-        </w:rPr>
         <w:br/>
       </w:r>
       <w:r>
         <w:rPr>
           <w:rFonts w:ascii="Futura Book" w:hAnsi="Futura Book"/>
-          <w:b/>
-          <w:bCs/>
-        </w:rPr>
-        <w:t>Succeed When</w:t>
-      </w:r>
-      <w:r>
-        <w:rPr>
-          <w:rFonts w:ascii="Futura Book" w:hAnsi="Futura Book"/>
-        </w:rPr>
-        <w:t xml:space="preserve"> </w:t>
-      </w:r>
-      <w:r>
-        <w:rPr>
-          <w:rFonts w:ascii="Futura Book" w:hAnsi="Futura Book"/>
-          <w:i/>
-          <w:iCs/>
-        </w:rPr>
-        <w:t>(All Children / Any Child)</w:t>
-      </w:r>
-      <w:r>
-        <w:rPr>
-          <w:rFonts w:ascii="Futura Book" w:hAnsi="Futura Book"/>
-        </w:rPr>
-        <w:t xml:space="preserve"> </w:t>
-      </w:r>
-      <w:r>
-        <w:rPr>
-          <w:rFonts w:ascii="Futura Book" w:hAnsi="Futura Book"/>
         </w:rPr>
         <w:br/>
       </w:r>
-      <w:r>
-        <w:rPr>
-          <w:rFonts w:ascii="Futura Book" w:hAnsi="Futura Book"/>
-          <w:b/>
-          <w:bCs/>
-        </w:rPr>
-        <w:t>Fail When</w:t>
-      </w:r>
-      <w:r>
-        <w:rPr>
-          <w:rFonts w:ascii="Futura Book" w:hAnsi="Futura Book"/>
-        </w:rPr>
-        <w:t xml:space="preserve"> </w:t>
-      </w:r>
-      <w:r>
-        <w:rPr>
-          <w:rFonts w:ascii="Futura Book" w:hAnsi="Futura Book"/>
-          <w:i/>
-          <w:iCs/>
-        </w:rPr>
-        <w:t>(All Children / Any Child)</w:t>
-      </w:r>
-    </w:p>
-    <w:p>
-      <w:pPr>
-        <w:rPr>
-          <w:rFonts w:ascii="Futura Book" w:hAnsi="Futura Book"/>
-          <w:b/>
-          <w:bCs/>
-        </w:rPr>
-      </w:pPr>
-    </w:p>
-    <w:p>
-      <w:pPr>
-        <w:rPr>
-          <w:rFonts w:ascii="Futura Book" w:hAnsi="Futura Book"/>
-          <w:b/>
-          <w:bCs/>
-        </w:rPr>
-      </w:pPr>
-    </w:p>
-    <w:p>
-      <w:pPr>
-        <w:rPr>
-          <w:rFonts w:ascii="Futura Book" w:hAnsi="Futura Book"/>
-          <w:b/>
-          <w:bCs/>
-        </w:rPr>
-      </w:pPr>
-    </w:p>
-    <w:p>
-      <w:pPr>
-        <w:rPr>
-          <w:rFonts w:ascii="Futura Book" w:hAnsi="Futura Book"/>
-          <w:b/>
-          <w:bCs/>
-        </w:rPr>
-      </w:pPr>
     </w:p>
     <w:p>
       <w:pPr>
@@ -2348,6 +1810,7 @@
           <w:sz w:val="18"/>
           <w:szCs w:val="18"/>
         </w:rPr>
+        <w:lastRenderedPageBreak/>
         <w:drawing>
           <wp:anchor distT="0" distB="0" distL="114300" distR="114300" simplePos="0" relativeHeight="251696128" behindDoc="0" locked="0" layoutInCell="1" allowOverlap="1" wp14:anchorId="38AE8DEA" wp14:editId="74E83A32">
             <wp:simplePos x="0" y="0"/>
@@ -2459,7 +1922,7 @@
           <w:b/>
           <w:bCs/>
         </w:rPr>
-        <w:t>Repeater</w:t>
+        <w:t>Repeater - Repeats its child behaviour for a configured number of loops. Loops: Int.</w:t>
       </w:r>
       <w:r>
         <w:rPr>
@@ -2473,41 +1936,7 @@
         <w:rPr>
           <w:rFonts w:ascii="Futura Book" w:hAnsi="Futura Book"/>
         </w:rPr>
-        <w:t>Repeats all children a number of times.</w:t>
-      </w:r>
-      <w:r>
-        <w:rPr>
-          <w:rFonts w:ascii="Futura Book" w:hAnsi="Futura Book"/>
-        </w:rPr>
-        <w:t xml:space="preserve"> </w:t>
-      </w:r>
-      <w:r>
-        <w:rPr>
-          <w:rFonts w:ascii="Futura Book" w:hAnsi="Futura Book"/>
-        </w:rPr>
         <w:br/>
-      </w:r>
-      <w:r>
-        <w:rPr>
-          <w:rFonts w:ascii="Futura Book" w:hAnsi="Futura Book"/>
-          <w:b/>
-          <w:bCs/>
-        </w:rPr>
-        <w:t>Loops</w:t>
-      </w:r>
-      <w:r>
-        <w:rPr>
-          <w:rFonts w:ascii="Futura Book" w:hAnsi="Futura Book"/>
-        </w:rPr>
-        <w:t xml:space="preserve"> </w:t>
-      </w:r>
-      <w:r>
-        <w:rPr>
-          <w:rFonts w:ascii="Futura Book" w:hAnsi="Futura Book"/>
-          <w:i/>
-          <w:iCs/>
-        </w:rPr>
-        <w:t>(Int)</w:t>
       </w:r>
     </w:p>
     <w:p>
@@ -2637,7 +2066,7 @@
           <w:b/>
           <w:bCs/>
         </w:rPr>
-        <w:t>Wait</w:t>
+        <w:t>Wait - Pauses this branch for a configured duration. Duration: Float, in seconds.</w:t>
       </w:r>
       <w:r>
         <w:rPr>
@@ -2648,7 +2077,7 @@
           <w:sz w:val="18"/>
           <w:szCs w:val="18"/>
         </w:rPr>
-        <w:t xml:space="preserve"> </w:t>
+        <w:br/>
       </w:r>
       <w:r>
         <w:rPr>
@@ -2660,56 +2089,6 @@
           <w:szCs w:val="18"/>
         </w:rPr>
         <w:br/>
-      </w:r>
-      <w:r>
-        <w:rPr>
-          <w:rFonts w:ascii="Futura Book" w:hAnsi="Futura Book"/>
-        </w:rPr>
-        <w:t>Pauses graph execution.</w:t>
-      </w:r>
-      <w:r>
-        <w:rPr>
-          <w:rFonts w:ascii="Merriweather 18pt" w:hAnsi="Merriweather 18pt"/>
-          <w:b/>
-          <w:bCs/>
-          <w:noProof/>
-          <w:sz w:val="18"/>
-          <w:szCs w:val="18"/>
-        </w:rPr>
-        <w:t xml:space="preserve"> </w:t>
-      </w:r>
-      <w:r>
-        <w:rPr>
-          <w:rFonts w:ascii="Merriweather 18pt" w:hAnsi="Merriweather 18pt"/>
-          <w:b/>
-          <w:bCs/>
-          <w:noProof/>
-          <w:sz w:val="18"/>
-          <w:szCs w:val="18"/>
-        </w:rPr>
-        <w:br/>
-      </w:r>
-      <w:r>
-        <w:rPr>
-          <w:rFonts w:ascii="Futura Book" w:hAnsi="Futura Book"/>
-          <w:b/>
-          <w:bCs/>
-        </w:rPr>
-        <w:t>Duration</w:t>
-      </w:r>
-      <w:r>
-        <w:rPr>
-          <w:rFonts w:ascii="Futura Book" w:hAnsi="Futura Book"/>
-        </w:rPr>
-        <w:t xml:space="preserve"> </w:t>
-      </w:r>
-      <w:r>
-        <w:rPr>
-          <w:rFonts w:ascii="Futura Book" w:hAnsi="Futura Book"/>
-          <w:i/>
-          <w:iCs/>
-        </w:rPr>
-        <w:t>(Float - Seconds)</w:t>
       </w:r>
     </w:p>
     <w:p>
@@ -2820,7 +2199,7 @@
           <w:b/>
           <w:bCs/>
         </w:rPr>
-        <w:t>Cooldown</w:t>
+        <w:t>Cooldown - Allows its child to run only after a cooldown has finished. Cooldown: Float, in seconds. Ready First: Bool.</w:t>
       </w:r>
       <w:r>
         <w:rPr>
@@ -2834,74 +2213,13 @@
         <w:rPr>
           <w:rFonts w:ascii="Futura Book" w:hAnsi="Futura Book"/>
         </w:rPr>
-        <w:t>Allows its child to execute only after a cooldown.</w:t>
-      </w:r>
-      <w:r>
-        <w:rPr>
-          <w:rFonts w:ascii="Futura Book" w:hAnsi="Futura Book"/>
-        </w:rPr>
         <w:br/>
       </w:r>
       <w:r>
         <w:rPr>
           <w:rFonts w:ascii="Futura Book" w:hAnsi="Futura Book"/>
-          <w:b/>
-          <w:bCs/>
-        </w:rPr>
-        <w:t>Cooldown</w:t>
-      </w:r>
-      <w:r>
-        <w:rPr>
-          <w:rFonts w:ascii="Futura Book" w:hAnsi="Futura Book"/>
-        </w:rPr>
-        <w:t xml:space="preserve"> </w:t>
-      </w:r>
-      <w:r>
-        <w:rPr>
-          <w:rFonts w:ascii="Futura Book" w:hAnsi="Futura Book"/>
-          <w:i/>
-          <w:iCs/>
-        </w:rPr>
-        <w:t>(Float - Seconds)</w:t>
-      </w:r>
-      <w:r>
-        <w:rPr>
-          <w:rFonts w:ascii="Futura Book" w:hAnsi="Futura Book"/>
         </w:rPr>
         <w:br/>
-      </w:r>
-      <w:r>
-        <w:rPr>
-          <w:rFonts w:ascii="Futura Book" w:hAnsi="Futura Book"/>
-          <w:b/>
-          <w:bCs/>
-        </w:rPr>
-        <w:t>Ready First</w:t>
-      </w:r>
-      <w:r>
-        <w:rPr>
-          <w:rFonts w:ascii="Futura Book" w:hAnsi="Futura Book"/>
-        </w:rPr>
-        <w:t xml:space="preserve"> </w:t>
-      </w:r>
-      <w:r>
-        <w:rPr>
-          <w:rFonts w:ascii="Futura Book" w:hAnsi="Futura Book"/>
-          <w:i/>
-          <w:iCs/>
-        </w:rPr>
-        <w:t>(Bool)</w:t>
-      </w:r>
-      <w:r>
-        <w:rPr>
-          <w:rFonts w:ascii="Merriweather 18pt" w:hAnsi="Merriweather 18pt"/>
-          <w:b/>
-          <w:bCs/>
-          <w:noProof/>
-          <w:sz w:val="18"/>
-          <w:szCs w:val="18"/>
-        </w:rPr>
-        <w:t xml:space="preserve"> </w:t>
       </w:r>
     </w:p>
     <w:p>
@@ -3012,7 +2330,7 @@
           <w:b/>
           <w:bCs/>
         </w:rPr>
-        <w:t>Run Once</w:t>
+        <w:t>Run Once - Runs its child once, then returns the configured result on later visits. Return After Run: Success or Failure.</w:t>
       </w:r>
       <w:r>
         <w:rPr>
@@ -3026,35 +2344,7 @@
         <w:rPr>
           <w:rFonts w:ascii="Futura Book" w:hAnsi="Futura Book"/>
         </w:rPr>
-        <w:t>Executes its child a single time.</w:t>
-      </w:r>
-      <w:r>
-        <w:rPr>
-          <w:rFonts w:ascii="Futura Book" w:hAnsi="Futura Book"/>
-        </w:rPr>
         <w:br/>
-      </w:r>
-      <w:r>
-        <w:rPr>
-          <w:rFonts w:ascii="Futura Book" w:hAnsi="Futura Book"/>
-          <w:b/>
-          <w:bCs/>
-        </w:rPr>
-        <w:t>Return After Run</w:t>
-      </w:r>
-      <w:r>
-        <w:rPr>
-          <w:rFonts w:ascii="Futura Book" w:hAnsi="Futura Book"/>
-        </w:rPr>
-        <w:t xml:space="preserve"> </w:t>
-      </w:r>
-      <w:r>
-        <w:rPr>
-          <w:rFonts w:ascii="Futura Book" w:hAnsi="Futura Book"/>
-          <w:i/>
-          <w:iCs/>
-        </w:rPr>
-        <w:t>(Success / Failure)</w:t>
       </w:r>
     </w:p>
     <w:p>
@@ -3188,7 +2478,7 @@
           <w:b/>
           <w:bCs/>
         </w:rPr>
-        <w:t>Reroute</w:t>
+        <w:t>Reroute - Redirects flow wires to keep large graphs readable.</w:t>
       </w:r>
       <w:r>
         <w:rPr>
@@ -3197,12 +2487,6 @@
           <w:bCs/>
         </w:rPr>
         <w:br/>
-      </w:r>
-      <w:r>
-        <w:rPr>
-          <w:rFonts w:ascii="Futura Book" w:hAnsi="Futura Book"/>
-        </w:rPr>
-        <w:t>Organizational node used to keep graphs clean.</w:t>
       </w:r>
     </w:p>
     <w:p>
@@ -3332,7 +2616,7 @@
           <w:b/>
           <w:bCs/>
         </w:rPr>
-        <w:t>Move To</w:t>
+        <w:t>Move To - Moves the boss toward a player, boss position, fixed position, or target point. Common settings: Target Source, Target Offset, Move Speed, Stop Distance, Stop On Arrival, Timeout.</w:t>
       </w:r>
       <w:r>
         <w:rPr>
@@ -3346,199 +2630,31 @@
         <w:rPr>
           <w:rFonts w:ascii="Futura Book" w:hAnsi="Futura Book"/>
         </w:rPr>
-        <w:t>Moves the boss toward a target.</w:t>
-      </w:r>
-      <w:r>
-        <w:rPr>
-          <w:rFonts w:ascii="Futura Book" w:hAnsi="Futura Book"/>
-        </w:rPr>
         <w:br/>
       </w:r>
       <w:r>
         <w:rPr>
           <w:rFonts w:ascii="Futura Book" w:hAnsi="Futura Book"/>
-          <w:b/>
-          <w:bCs/>
-        </w:rPr>
-        <w:t>Target Source</w:t>
-      </w:r>
-      <w:r>
-        <w:rPr>
-          <w:rFonts w:ascii="Futura Book" w:hAnsi="Futura Book"/>
-        </w:rPr>
-        <w:t xml:space="preserve"> </w:t>
-      </w:r>
-      <w:r>
-        <w:rPr>
-          <w:rFonts w:ascii="Futura Book" w:hAnsi="Futura Book"/>
-          <w:i/>
-          <w:iCs/>
-        </w:rPr>
-        <w:t>(Player / Boss / Fixed Position / Target Point)</w:t>
-      </w:r>
-      <w:r>
-        <w:rPr>
-          <w:rFonts w:ascii="Futura Book" w:hAnsi="Futura Book"/>
-        </w:rPr>
-        <w:t xml:space="preserve"> </w:t>
-      </w:r>
-      <w:r>
-        <w:rPr>
-          <w:rFonts w:ascii="Futura Book" w:hAnsi="Futura Book"/>
-          <w:b/>
-          <w:bCs/>
-        </w:rPr>
-        <w:t>Target Offset</w:t>
-      </w:r>
-      <w:r>
-        <w:rPr>
-          <w:rFonts w:ascii="Futura Book" w:hAnsi="Futura Book"/>
-        </w:rPr>
-        <w:t xml:space="preserve"> </w:t>
-      </w:r>
-      <w:r>
-        <w:rPr>
-          <w:rFonts w:ascii="Futura Book" w:hAnsi="Futura Book"/>
-          <w:i/>
-          <w:iCs/>
-        </w:rPr>
-        <w:t>(Vector2)</w:t>
-      </w:r>
-      <w:r>
-        <w:rPr>
-          <w:rFonts w:ascii="Futura Book" w:hAnsi="Futura Book"/>
-        </w:rPr>
-        <w:t xml:space="preserve"> </w:t>
-      </w:r>
-      <w:r>
-        <w:rPr>
-          <w:rFonts w:ascii="Futura Book" w:hAnsi="Futura Book"/>
         </w:rPr>
         <w:br/>
       </w:r>
       <w:r>
         <w:rPr>
           <w:rFonts w:ascii="Futura Book" w:hAnsi="Futura Book"/>
-          <w:b/>
-          <w:bCs/>
-        </w:rPr>
-        <w:t>Move Speed</w:t>
-      </w:r>
-      <w:r>
-        <w:rPr>
-          <w:rFonts w:ascii="Futura Book" w:hAnsi="Futura Book"/>
-        </w:rPr>
-        <w:t xml:space="preserve"> </w:t>
-      </w:r>
-      <w:r>
-        <w:rPr>
-          <w:rFonts w:ascii="Futura Book" w:hAnsi="Futura Book"/>
-          <w:i/>
-          <w:iCs/>
-        </w:rPr>
-        <w:t>(Float)</w:t>
-      </w:r>
-      <w:r>
-        <w:rPr>
-          <w:rFonts w:ascii="Futura Book" w:hAnsi="Futura Book"/>
-        </w:rPr>
-        <w:t xml:space="preserve"> </w:t>
-      </w:r>
-      <w:r>
-        <w:rPr>
-          <w:rFonts w:ascii="Futura Book" w:hAnsi="Futura Book"/>
         </w:rPr>
         <w:br/>
       </w:r>
       <w:r>
         <w:rPr>
           <w:rFonts w:ascii="Futura Book" w:hAnsi="Futura Book"/>
-          <w:b/>
-          <w:bCs/>
-        </w:rPr>
-        <w:t>Stop Distance</w:t>
-      </w:r>
-      <w:r>
-        <w:rPr>
-          <w:rFonts w:ascii="Futura Book" w:hAnsi="Futura Book"/>
-        </w:rPr>
-        <w:t xml:space="preserve"> </w:t>
-      </w:r>
-      <w:r>
-        <w:rPr>
-          <w:rFonts w:ascii="Futura Book" w:hAnsi="Futura Book"/>
-          <w:i/>
-          <w:iCs/>
-        </w:rPr>
-        <w:t>(Float)</w:t>
-      </w:r>
-      <w:r>
-        <w:rPr>
-          <w:rFonts w:ascii="Futura Book" w:hAnsi="Futura Book"/>
-        </w:rPr>
-        <w:t xml:space="preserve"> </w:t>
-      </w:r>
-      <w:r>
-        <w:rPr>
-          <w:rFonts w:ascii="Futura Book" w:hAnsi="Futura Book"/>
         </w:rPr>
         <w:br/>
       </w:r>
       <w:r>
         <w:rPr>
           <w:rFonts w:ascii="Futura Book" w:hAnsi="Futura Book"/>
-          <w:b/>
-          <w:bCs/>
-        </w:rPr>
-        <w:t>Stop On Arrival</w:t>
-      </w:r>
-      <w:r>
-        <w:rPr>
-          <w:rFonts w:ascii="Futura Book" w:hAnsi="Futura Book"/>
-        </w:rPr>
-        <w:t xml:space="preserve"> </w:t>
-      </w:r>
-      <w:r>
-        <w:rPr>
-          <w:rFonts w:ascii="Futura Book" w:hAnsi="Futura Book"/>
-          <w:i/>
-          <w:iCs/>
-        </w:rPr>
-        <w:t>(Bool)</w:t>
-      </w:r>
-      <w:r>
-        <w:rPr>
-          <w:rFonts w:ascii="Futura Book" w:hAnsi="Futura Book"/>
-        </w:rPr>
-        <w:t xml:space="preserve"> </w:t>
-      </w:r>
-      <w:r>
-        <w:rPr>
-          <w:rFonts w:ascii="Futura Book" w:hAnsi="Futura Book"/>
         </w:rPr>
         <w:br/>
-      </w:r>
-      <w:r>
-        <w:rPr>
-          <w:rFonts w:ascii="Futura Book" w:hAnsi="Futura Book"/>
-          <w:b/>
-          <w:bCs/>
-        </w:rPr>
-        <w:t>Timeout</w:t>
-      </w:r>
-      <w:r>
-        <w:rPr>
-          <w:rFonts w:ascii="Futura Book" w:hAnsi="Futura Book"/>
-        </w:rPr>
-        <w:t xml:space="preserve"> </w:t>
-      </w:r>
-      <w:r>
-        <w:rPr>
-          <w:rFonts w:ascii="Futura Book" w:hAnsi="Futura Book"/>
-          <w:i/>
-          <w:iCs/>
-        </w:rPr>
-        <w:t>(Float - Seconds)</w:t>
       </w:r>
     </w:p>
     <w:p>
@@ -3690,7 +2806,7 @@
           <w:b/>
           <w:bCs/>
         </w:rPr>
-        <w:t>Teleport To</w:t>
+        <w:t>Teleport To - Instantly moves the boss to a player, boss position, fixed position, or target point.</w:t>
       </w:r>
       <w:r>
         <w:rPr>
@@ -3704,97 +2820,13 @@
         <w:rPr>
           <w:rFonts w:ascii="Futura Book" w:hAnsi="Futura Book"/>
         </w:rPr>
-        <w:t>Instantly moves the boss to a location.</w:t>
-      </w:r>
-      <w:r>
-        <w:rPr>
-          <w:rFonts w:ascii="Futura Book" w:hAnsi="Futura Book"/>
-        </w:rPr>
         <w:br/>
       </w:r>
       <w:r>
         <w:rPr>
           <w:rFonts w:ascii="Futura Book" w:hAnsi="Futura Book"/>
-          <w:b/>
-          <w:bCs/>
-        </w:rPr>
-        <w:t>Target Source</w:t>
-      </w:r>
-      <w:r>
-        <w:rPr>
-          <w:rFonts w:ascii="Futura Book" w:hAnsi="Futura Book"/>
-        </w:rPr>
-        <w:t xml:space="preserve"> </w:t>
-      </w:r>
-      <w:r>
-        <w:rPr>
-          <w:rFonts w:ascii="Futura Book" w:hAnsi="Futura Book"/>
-          <w:i/>
-          <w:iCs/>
-        </w:rPr>
-        <w:t>(Player / Boss / Fixed Position / Target Point)</w:t>
-      </w:r>
-      <w:r>
-        <w:rPr>
-          <w:rFonts w:ascii="Futura Book" w:hAnsi="Futura Book"/>
-        </w:rPr>
-        <w:t xml:space="preserve"> </w:t>
-      </w:r>
-      <w:r>
-        <w:rPr>
-          <w:rFonts w:ascii="Futura Book" w:hAnsi="Futura Book"/>
-          <w:b/>
-          <w:bCs/>
-        </w:rPr>
-        <w:t>Fixed Position</w:t>
-      </w:r>
-      <w:r>
-        <w:rPr>
-          <w:rFonts w:ascii="Futura Book" w:hAnsi="Futura Book"/>
-        </w:rPr>
-        <w:t xml:space="preserve"> </w:t>
-      </w:r>
-      <w:r>
-        <w:rPr>
-          <w:rFonts w:ascii="Futura Book" w:hAnsi="Futura Book"/>
-          <w:i/>
-          <w:iCs/>
-        </w:rPr>
-        <w:t>(Vector2)</w:t>
-      </w:r>
-      <w:r>
-        <w:rPr>
-          <w:rFonts w:ascii="Futura Book" w:hAnsi="Futura Book"/>
-        </w:rPr>
-        <w:t xml:space="preserve"> </w:t>
-      </w:r>
-      <w:r>
-        <w:rPr>
-          <w:rFonts w:ascii="Futura Book" w:hAnsi="Futura Book"/>
         </w:rPr>
         <w:br/>
-      </w:r>
-      <w:r>
-        <w:rPr>
-          <w:rFonts w:ascii="Futura Book" w:hAnsi="Futura Book"/>
-          <w:b/>
-          <w:bCs/>
-        </w:rPr>
-        <w:t>Target Point</w:t>
-      </w:r>
-      <w:r>
-        <w:rPr>
-          <w:rFonts w:ascii="Futura Book" w:hAnsi="Futura Book"/>
-        </w:rPr>
-        <w:t xml:space="preserve"> </w:t>
-      </w:r>
-      <w:r>
-        <w:rPr>
-          <w:rFonts w:ascii="Futura Book" w:hAnsi="Futura Book"/>
-          <w:i/>
-          <w:iCs/>
-        </w:rPr>
-        <w:t>(Target Point Key)</w:t>
       </w:r>
     </w:p>
     <w:p>
@@ -3924,7 +2956,7 @@
           <w:b/>
           <w:bCs/>
         </w:rPr>
-        <w:t>Shoot Pattern</w:t>
+        <w:t>Shoot Pattern - Spawns bullets in a selected pattern from the chosen source. Supports single shots, spread shots, circle shots, and aiming at the player.</w:t>
       </w:r>
       <w:r>
         <w:rPr>
@@ -3938,138 +2970,47 @@
         <w:rPr>
           <w:rFonts w:ascii="Futura Book" w:hAnsi="Futura Book"/>
         </w:rPr>
-        <w:t>Fires bullets in a predefined pattern.</w:t>
-      </w:r>
-      <w:r>
-        <w:rPr>
-          <w:rFonts w:ascii="Futura Book" w:hAnsi="Futura Book"/>
-        </w:rPr>
         <w:br/>
       </w:r>
       <w:r>
         <w:rPr>
           <w:rFonts w:ascii="Futura Book" w:hAnsi="Futura Book"/>
-          <w:b/>
-          <w:bCs/>
-        </w:rPr>
-        <w:t>Pattern</w:t>
-      </w:r>
-      <w:r>
-        <w:rPr>
-          <w:rFonts w:ascii="Futura Book" w:hAnsi="Futura Book"/>
-        </w:rPr>
-        <w:t xml:space="preserve"> </w:t>
-      </w:r>
-      <w:r>
-        <w:rPr>
-          <w:rFonts w:ascii="Futura Book" w:hAnsi="Futura Book"/>
-          <w:i/>
-          <w:iCs/>
-        </w:rPr>
-        <w:t>(Single / Spread / Circle / Aim At Player)</w:t>
-      </w:r>
-      <w:r>
-        <w:rPr>
-          <w:rFonts w:ascii="Futura Book" w:hAnsi="Futura Book"/>
-        </w:rPr>
-        <w:t xml:space="preserve"> </w:t>
-      </w:r>
-      <w:r>
-        <w:rPr>
-          <w:rFonts w:ascii="Futura Book" w:hAnsi="Futura Book"/>
         </w:rPr>
         <w:br/>
       </w:r>
       <w:r>
         <w:rPr>
           <w:rFonts w:ascii="Futura Book" w:hAnsi="Futura Book"/>
-          <w:b/>
-          <w:bCs/>
-        </w:rPr>
-        <w:t>Fire From</w:t>
-      </w:r>
-      <w:r>
-        <w:rPr>
-          <w:rFonts w:ascii="Futura Book" w:hAnsi="Futura Book"/>
-        </w:rPr>
-        <w:t xml:space="preserve"> </w:t>
-      </w:r>
-      <w:r>
-        <w:rPr>
-          <w:rFonts w:ascii="Futura Book" w:hAnsi="Futura Book"/>
-          <w:i/>
-          <w:iCs/>
-        </w:rPr>
-        <w:t>(Boss / Player / Fixed Position / Target Point)</w:t>
-      </w:r>
-      <w:r>
-        <w:rPr>
-          <w:rFonts w:ascii="Futura Book" w:hAnsi="Futura Book"/>
-        </w:rPr>
-        <w:t xml:space="preserve"> </w:t>
-      </w:r>
-      <w:r>
-        <w:rPr>
-          <w:rFonts w:ascii="Futura Book" w:hAnsi="Futura Book"/>
         </w:rPr>
         <w:br/>
       </w:r>
       <w:r>
         <w:rPr>
           <w:rFonts w:ascii="Futura Book" w:hAnsi="Futura Book"/>
-          <w:b/>
-          <w:bCs/>
-        </w:rPr>
-        <w:t>Aim At</w:t>
-      </w:r>
-      <w:r>
-        <w:rPr>
-          <w:rFonts w:ascii="Futura Book" w:hAnsi="Futura Book"/>
-        </w:rPr>
-        <w:t xml:space="preserve"> </w:t>
-      </w:r>
-      <w:r>
-        <w:rPr>
-          <w:rFonts w:ascii="Futura Book" w:hAnsi="Futura Book"/>
-          <w:i/>
-          <w:iCs/>
-        </w:rPr>
-        <w:t>(Fixed Direction / Player / Boss / Player Snapshot)</w:t>
-      </w:r>
-      <w:r>
-        <w:rPr>
-          <w:rFonts w:ascii="Futura Book" w:hAnsi="Futura Book"/>
-        </w:rPr>
-        <w:t xml:space="preserve"> </w:t>
-      </w:r>
-      <w:r>
-        <w:rPr>
-          <w:rFonts w:ascii="Futura Book" w:hAnsi="Futura Book"/>
         </w:rPr>
         <w:br/>
       </w:r>
-      <w:r>
-        <w:rPr>
-          <w:rFonts w:ascii="Futura Book" w:hAnsi="Futura Book"/>
-          <w:b/>
-          <w:bCs/>
-        </w:rPr>
-        <w:t>Bullet Prefab</w:t>
-      </w:r>
-      <w:r>
-        <w:rPr>
-          <w:rFonts w:ascii="Futura Book" w:hAnsi="Futura Book"/>
-        </w:rPr>
-        <w:t xml:space="preserve"> </w:t>
-      </w:r>
-      <w:r>
-        <w:rPr>
-          <w:rFonts w:ascii="Futura Book" w:hAnsi="Futura Book"/>
-          <w:i/>
-          <w:iCs/>
-        </w:rPr>
-        <w:t>(GameObject)</w:t>
-      </w:r>
+    </w:p>
+    <w:p>
+      <w:pPr>
+        <w:rPr>
+          <w:rFonts w:ascii="Futura Book" w:hAnsi="Futura Book"/>
+        </w:rPr>
+      </w:pPr>
+    </w:p>
+    <w:p>
+      <w:pPr>
+        <w:rPr>
+          <w:rFonts w:ascii="Futura Book" w:hAnsi="Futura Book"/>
+        </w:rPr>
+      </w:pPr>
+    </w:p>
+    <w:p>
+      <w:pPr>
+        <w:rPr>
+          <w:rFonts w:ascii="Futura Book" w:hAnsi="Futura Book"/>
+        </w:rPr>
+      </w:pPr>
       <w:r>
         <w:rPr>
           <w:rFonts w:ascii="Merriweather 18pt" w:hAnsi="Merriweather 18pt"/>
@@ -4079,38 +3020,7 @@
           <w:sz w:val="18"/>
           <w:szCs w:val="18"/>
         </w:rPr>
-        <w:t xml:space="preserve"> </w:t>
-      </w:r>
-    </w:p>
-    <w:p>
-      <w:pPr>
-        <w:rPr>
-          <w:rFonts w:ascii="Futura Book" w:hAnsi="Futura Book"/>
-        </w:rPr>
-      </w:pPr>
-    </w:p>
-    <w:p>
-      <w:pPr>
-        <w:rPr>
-          <w:rFonts w:ascii="Futura Book" w:hAnsi="Futura Book"/>
-        </w:rPr>
-      </w:pPr>
-    </w:p>
-    <w:p>
-      <w:pPr>
-        <w:rPr>
-          <w:rFonts w:ascii="Futura Book" w:hAnsi="Futura Book"/>
-        </w:rPr>
-      </w:pPr>
-      <w:r>
-        <w:rPr>
-          <w:rFonts w:ascii="Merriweather 18pt" w:hAnsi="Merriweather 18pt"/>
-          <w:b/>
-          <w:bCs/>
-          <w:noProof/>
-          <w:sz w:val="18"/>
-          <w:szCs w:val="18"/>
-        </w:rPr>
+        <w:lastRenderedPageBreak/>
         <w:drawing>
           <wp:anchor distT="0" distB="0" distL="114300" distR="114300" simplePos="0" relativeHeight="251709440" behindDoc="0" locked="0" layoutInCell="1" allowOverlap="1" wp14:anchorId="4BAB5B5F" wp14:editId="7C8EF053">
             <wp:simplePos x="0" y="0"/>
@@ -4219,7 +3129,7 @@
           <w:b/>
           <w:bCs/>
         </w:rPr>
-        <w:t>Spawn</w:t>
+        <w:t>Spawn - Instantiates a prefab from the chosen source, with an optional spawn offset.</w:t>
       </w:r>
       <w:r>
         <w:rPr>
@@ -4233,97 +3143,13 @@
         <w:rPr>
           <w:rFonts w:ascii="Futura Book" w:hAnsi="Futura Book"/>
         </w:rPr>
-        <w:t>Spawns an object.</w:t>
-      </w:r>
-      <w:r>
-        <w:rPr>
-          <w:rFonts w:ascii="Futura Book" w:hAnsi="Futura Book"/>
-        </w:rPr>
         <w:br/>
       </w:r>
       <w:r>
         <w:rPr>
           <w:rFonts w:ascii="Futura Book" w:hAnsi="Futura Book"/>
-          <w:b/>
-          <w:bCs/>
-        </w:rPr>
-        <w:t>Spawn From</w:t>
-      </w:r>
-      <w:r>
-        <w:rPr>
-          <w:rFonts w:ascii="Futura Book" w:hAnsi="Futura Book"/>
-        </w:rPr>
-        <w:t xml:space="preserve"> </w:t>
-      </w:r>
-      <w:r>
-        <w:rPr>
-          <w:rFonts w:ascii="Futura Book" w:hAnsi="Futura Book"/>
-          <w:i/>
-          <w:iCs/>
-        </w:rPr>
-        <w:t>(Boss / Player / Fixed Position / Target Point)</w:t>
-      </w:r>
-      <w:r>
-        <w:rPr>
-          <w:rFonts w:ascii="Futura Book" w:hAnsi="Futura Book"/>
-        </w:rPr>
-        <w:t xml:space="preserve"> </w:t>
-      </w:r>
-      <w:r>
-        <w:rPr>
-          <w:rFonts w:ascii="Futura Book" w:hAnsi="Futura Book"/>
-          <w:b/>
-          <w:bCs/>
-        </w:rPr>
-        <w:t>Prefab</w:t>
-      </w:r>
-      <w:r>
-        <w:rPr>
-          <w:rFonts w:ascii="Futura Book" w:hAnsi="Futura Book"/>
-        </w:rPr>
-        <w:t xml:space="preserve"> </w:t>
-      </w:r>
-      <w:r>
-        <w:rPr>
-          <w:rFonts w:ascii="Futura Book" w:hAnsi="Futura Book"/>
-          <w:i/>
-          <w:iCs/>
-        </w:rPr>
-        <w:t>(GameObject)</w:t>
-      </w:r>
-      <w:r>
-        <w:rPr>
-          <w:rFonts w:ascii="Futura Book" w:hAnsi="Futura Book"/>
-        </w:rPr>
-        <w:t xml:space="preserve"> </w:t>
-      </w:r>
-      <w:r>
-        <w:rPr>
-          <w:rFonts w:ascii="Futura Book" w:hAnsi="Futura Book"/>
         </w:rPr>
         <w:br/>
-      </w:r>
-      <w:r>
-        <w:rPr>
-          <w:rFonts w:ascii="Futura Book" w:hAnsi="Futura Book"/>
-          <w:b/>
-          <w:bCs/>
-        </w:rPr>
-        <w:t>Spawn Offset</w:t>
-      </w:r>
-      <w:r>
-        <w:rPr>
-          <w:rFonts w:ascii="Futura Book" w:hAnsi="Futura Book"/>
-        </w:rPr>
-        <w:t xml:space="preserve"> </w:t>
-      </w:r>
-      <w:r>
-        <w:rPr>
-          <w:rFonts w:ascii="Futura Book" w:hAnsi="Futura Book"/>
-          <w:i/>
-          <w:iCs/>
-        </w:rPr>
-        <w:t>(Vector2)</w:t>
       </w:r>
     </w:p>
     <w:p>
@@ -4341,7 +3167,6 @@
           <w:sz w:val="18"/>
           <w:szCs w:val="18"/>
         </w:rPr>
-        <w:lastRenderedPageBreak/>
         <w:drawing>
           <wp:anchor distT="0" distB="0" distL="114300" distR="114300" simplePos="0" relativeHeight="251676672" behindDoc="0" locked="0" layoutInCell="1" allowOverlap="1" wp14:anchorId="1106E88A" wp14:editId="147DFF35">
             <wp:simplePos x="0" y="0"/>
@@ -4451,7 +3276,7 @@
           <w:b/>
           <w:bCs/>
         </w:rPr>
-        <w:t>Throw</w:t>
+        <w:t>Throw - Launches a Rigidbody2D prefab from one source toward a target. Useful for arcing or timed projectile attacks.</w:t>
       </w:r>
       <w:r>
         <w:rPr>
@@ -4465,199 +3290,37 @@
         <w:rPr>
           <w:rFonts w:ascii="Futura Book" w:hAnsi="Futura Book"/>
         </w:rPr>
-        <w:t>Launches an object toward a target.</w:t>
-      </w:r>
-      <w:r>
-        <w:rPr>
-          <w:rFonts w:ascii="Futura Book" w:hAnsi="Futura Book"/>
-        </w:rPr>
         <w:br/>
       </w:r>
       <w:r>
         <w:rPr>
           <w:rFonts w:ascii="Futura Book" w:hAnsi="Futura Book"/>
-          <w:b/>
-          <w:bCs/>
-        </w:rPr>
-        <w:t>Spawn From</w:t>
-      </w:r>
-      <w:r>
-        <w:rPr>
-          <w:rFonts w:ascii="Futura Book" w:hAnsi="Futura Book"/>
-        </w:rPr>
-        <w:t xml:space="preserve"> </w:t>
-      </w:r>
-      <w:r>
-        <w:rPr>
-          <w:rFonts w:ascii="Futura Book" w:hAnsi="Futura Book"/>
-          <w:i/>
-          <w:iCs/>
-        </w:rPr>
-        <w:t>(Boss / Player / Fixed Position / Target Point)</w:t>
-      </w:r>
-      <w:r>
-        <w:rPr>
-          <w:rFonts w:ascii="Futura Book" w:hAnsi="Futura Book"/>
-        </w:rPr>
-        <w:t xml:space="preserve"> </w:t>
-      </w:r>
-      <w:r>
-        <w:rPr>
-          <w:rFonts w:ascii="Futura Book" w:hAnsi="Futura Book"/>
         </w:rPr>
         <w:br/>
       </w:r>
       <w:r>
         <w:rPr>
           <w:rFonts w:ascii="Futura Book" w:hAnsi="Futura Book"/>
-          <w:b/>
-          <w:bCs/>
-        </w:rPr>
-        <w:t>Prefab</w:t>
-      </w:r>
-      <w:r>
-        <w:rPr>
-          <w:rFonts w:ascii="Futura Book" w:hAnsi="Futura Book"/>
-        </w:rPr>
-        <w:t xml:space="preserve"> </w:t>
-      </w:r>
-      <w:r>
-        <w:rPr>
-          <w:rFonts w:ascii="Futura Book" w:hAnsi="Futura Book"/>
-          <w:i/>
-          <w:iCs/>
-        </w:rPr>
-        <w:t>(GameObject)</w:t>
-      </w:r>
-      <w:r>
-        <w:rPr>
-          <w:rFonts w:ascii="Futura Book" w:hAnsi="Futura Book"/>
-        </w:rPr>
-        <w:t xml:space="preserve"> </w:t>
-      </w:r>
-      <w:r>
-        <w:rPr>
-          <w:rFonts w:ascii="Futura Book" w:hAnsi="Futura Book"/>
         </w:rPr>
         <w:br/>
       </w:r>
       <w:r>
         <w:rPr>
           <w:rFonts w:ascii="Futura Book" w:hAnsi="Futura Book"/>
-          <w:b/>
-          <w:bCs/>
-        </w:rPr>
-        <w:t>Spawn Offset</w:t>
-      </w:r>
-      <w:r>
-        <w:rPr>
-          <w:rFonts w:ascii="Futura Book" w:hAnsi="Futura Book"/>
-        </w:rPr>
-        <w:t xml:space="preserve"> </w:t>
-      </w:r>
-      <w:r>
-        <w:rPr>
-          <w:rFonts w:ascii="Futura Book" w:hAnsi="Futura Book"/>
-          <w:i/>
-          <w:iCs/>
-        </w:rPr>
-        <w:t>(Vector2)</w:t>
-      </w:r>
-      <w:r>
-        <w:rPr>
-          <w:rFonts w:ascii="Futura Book" w:hAnsi="Futura Book"/>
         </w:rPr>
         <w:br/>
       </w:r>
       <w:r>
         <w:rPr>
           <w:rFonts w:ascii="Futura Book" w:hAnsi="Futura Book"/>
-          <w:b/>
-          <w:bCs/>
-        </w:rPr>
-        <w:t>Target Offset</w:t>
-      </w:r>
-      <w:r>
-        <w:rPr>
-          <w:rFonts w:ascii="Futura Book" w:hAnsi="Futura Book"/>
-        </w:rPr>
-        <w:t xml:space="preserve"> </w:t>
-      </w:r>
-      <w:r>
-        <w:rPr>
-          <w:rFonts w:ascii="Futura Book" w:hAnsi="Futura Book"/>
-          <w:i/>
-          <w:iCs/>
-        </w:rPr>
-        <w:t>(Vector2)</w:t>
-      </w:r>
-      <w:r>
-        <w:rPr>
-          <w:rFonts w:ascii="Futura Book" w:hAnsi="Futura Book"/>
-        </w:rPr>
-        <w:t xml:space="preserve"> </w:t>
-      </w:r>
-      <w:r>
-        <w:rPr>
-          <w:rFonts w:ascii="Futura Book" w:hAnsi="Futura Book"/>
         </w:rPr>
         <w:br/>
       </w:r>
       <w:r>
         <w:rPr>
           <w:rFonts w:ascii="Futura Book" w:hAnsi="Futura Book"/>
-          <w:b/>
-          <w:bCs/>
-        </w:rPr>
-        <w:t>Flight Time</w:t>
-      </w:r>
-      <w:r>
-        <w:rPr>
-          <w:rFonts w:ascii="Futura Book" w:hAnsi="Futura Book"/>
-        </w:rPr>
-        <w:t xml:space="preserve"> </w:t>
-      </w:r>
-      <w:r>
-        <w:rPr>
-          <w:rFonts w:ascii="Futura Book" w:hAnsi="Futura Book"/>
-          <w:i/>
-          <w:iCs/>
-        </w:rPr>
-        <w:t>(Float)</w:t>
-      </w:r>
-      <w:r>
-        <w:rPr>
-          <w:rFonts w:ascii="Futura Book" w:hAnsi="Futura Book"/>
-        </w:rPr>
-        <w:t xml:space="preserve"> </w:t>
-      </w:r>
-      <w:r>
-        <w:rPr>
-          <w:rFonts w:ascii="Futura Book" w:hAnsi="Futura Book"/>
         </w:rPr>
         <w:br/>
-      </w:r>
-      <w:r>
-        <w:rPr>
-          <w:rFonts w:ascii="Futura Book" w:hAnsi="Futura Book"/>
-          <w:b/>
-          <w:bCs/>
-        </w:rPr>
-        <w:t>Spin Speed</w:t>
-      </w:r>
-      <w:r>
-        <w:rPr>
-          <w:rFonts w:ascii="Futura Book" w:hAnsi="Futura Book"/>
-        </w:rPr>
-        <w:t xml:space="preserve"> </w:t>
-      </w:r>
-      <w:r>
-        <w:rPr>
-          <w:rFonts w:ascii="Futura Book" w:hAnsi="Futura Book"/>
-          <w:i/>
-          <w:iCs/>
-        </w:rPr>
-        <w:t>(Float)</w:t>
       </w:r>
     </w:p>
     <w:p>
@@ -4829,7 +3492,7 @@
           <w:b/>
           <w:bCs/>
         </w:rPr>
-        <w:t>Animation</w:t>
+        <w:t>Animation - Controls the boss Animator through clips, triggers, parameters, or cross-fades.</w:t>
       </w:r>
       <w:r>
         <w:rPr>
@@ -4843,215 +3506,7 @@
         <w:rPr>
           <w:rFonts w:ascii="Futura Book" w:hAnsi="Futura Book"/>
         </w:rPr>
-        <w:t>Controls the boss Animator.</w:t>
-      </w:r>
-      <w:r>
-        <w:rPr>
-          <w:rFonts w:ascii="Futura Book" w:hAnsi="Futura Book"/>
-        </w:rPr>
         <w:br/>
-      </w:r>
-      <w:r>
-        <w:rPr>
-          <w:rFonts w:ascii="Futura Book" w:hAnsi="Futura Book"/>
-          <w:b/>
-          <w:bCs/>
-        </w:rPr>
-        <w:t>Mode</w:t>
-      </w:r>
-      <w:r>
-        <w:rPr>
-          <w:rFonts w:ascii="Futura Book" w:hAnsi="Futura Book"/>
-        </w:rPr>
-        <w:t xml:space="preserve"> </w:t>
-      </w:r>
-      <w:r>
-        <w:rPr>
-          <w:rFonts w:ascii="Futura Book" w:hAnsi="Futura Book"/>
-          <w:i/>
-          <w:iCs/>
-        </w:rPr>
-        <w:t>(Play Clip / Trigger / Set Bool / Set Float / Set Int / Cross Fade)</w:t>
-      </w:r>
-      <w:r>
-        <w:rPr>
-          <w:rFonts w:ascii="Futura Book" w:hAnsi="Futura Book"/>
-        </w:rPr>
-        <w:t xml:space="preserve"> </w:t>
-      </w:r>
-      <w:r>
-        <w:rPr>
-          <w:rFonts w:ascii="Futura Book" w:hAnsi="Futura Book"/>
-          <w:b/>
-          <w:bCs/>
-        </w:rPr>
-        <w:t>Animation Clip</w:t>
-      </w:r>
-      <w:r>
-        <w:rPr>
-          <w:rFonts w:ascii="Futura Book" w:hAnsi="Futura Book"/>
-        </w:rPr>
-        <w:t xml:space="preserve"> </w:t>
-      </w:r>
-      <w:r>
-        <w:rPr>
-          <w:rFonts w:ascii="Futura Book" w:hAnsi="Futura Book"/>
-          <w:i/>
-          <w:iCs/>
-        </w:rPr>
-        <w:t>(AnimationClip)</w:t>
-      </w:r>
-      <w:r>
-        <w:rPr>
-          <w:rFonts w:ascii="Futura Book" w:hAnsi="Futura Book"/>
-        </w:rPr>
-        <w:t xml:space="preserve"> </w:t>
-      </w:r>
-      <w:r>
-        <w:rPr>
-          <w:rFonts w:ascii="Futura Book" w:hAnsi="Futura Book" w:hint="eastAsia"/>
-        </w:rPr>
-        <w:t xml:space="preserve"> </w:t>
-      </w:r>
-      <w:r>
-        <w:rPr>
-          <w:rFonts w:ascii="Futura Book" w:hAnsi="Futura Book"/>
-          <w:b/>
-          <w:bCs/>
-        </w:rPr>
-        <w:t>Trigger</w:t>
-      </w:r>
-      <w:r>
-        <w:rPr>
-          <w:rFonts w:ascii="Futura Book" w:hAnsi="Futura Book"/>
-        </w:rPr>
-        <w:t xml:space="preserve"> </w:t>
-      </w:r>
-      <w:r>
-        <w:rPr>
-          <w:rFonts w:ascii="Futura Book" w:hAnsi="Futura Book"/>
-          <w:i/>
-          <w:iCs/>
-        </w:rPr>
-        <w:t>(String)</w:t>
-      </w:r>
-      <w:r>
-        <w:rPr>
-          <w:rFonts w:ascii="Futura Book" w:hAnsi="Futura Book"/>
-        </w:rPr>
-        <w:t xml:space="preserve"> </w:t>
-      </w:r>
-      <w:r>
-        <w:rPr>
-          <w:rFonts w:ascii="Futura Book" w:hAnsi="Futura Book"/>
-          <w:b/>
-          <w:bCs/>
-        </w:rPr>
-        <w:t>Bool</w:t>
-      </w:r>
-      <w:r>
-        <w:rPr>
-          <w:rFonts w:ascii="Futura Book" w:hAnsi="Futura Book"/>
-        </w:rPr>
-        <w:t xml:space="preserve"> </w:t>
-      </w:r>
-      <w:r>
-        <w:rPr>
-          <w:rFonts w:ascii="Futura Book" w:hAnsi="Futura Book"/>
-          <w:i/>
-          <w:iCs/>
-        </w:rPr>
-        <w:t>(String)</w:t>
-      </w:r>
-      <w:r>
-        <w:rPr>
-          <w:rFonts w:ascii="Futura Book" w:hAnsi="Futura Book"/>
-        </w:rPr>
-        <w:t xml:space="preserve"> </w:t>
-      </w:r>
-      <w:r>
-        <w:rPr>
-          <w:rFonts w:ascii="Futura Book" w:hAnsi="Futura Book" w:hint="eastAsia"/>
-        </w:rPr>
-        <w:t xml:space="preserve"> </w:t>
-      </w:r>
-      <w:r>
-        <w:rPr>
-          <w:rFonts w:ascii="Futura Book" w:hAnsi="Futura Book"/>
-          <w:b/>
-          <w:bCs/>
-        </w:rPr>
-        <w:t>Float</w:t>
-      </w:r>
-      <w:r>
-        <w:rPr>
-          <w:rFonts w:ascii="Futura Book" w:hAnsi="Futura Book"/>
-        </w:rPr>
-        <w:t xml:space="preserve"> </w:t>
-      </w:r>
-      <w:r>
-        <w:rPr>
-          <w:rFonts w:ascii="Futura Book" w:hAnsi="Futura Book"/>
-          <w:i/>
-          <w:iCs/>
-        </w:rPr>
-        <w:t>(String + Float)</w:t>
-      </w:r>
-      <w:r>
-        <w:rPr>
-          <w:rFonts w:ascii="Futura Book" w:hAnsi="Futura Book"/>
-        </w:rPr>
-        <w:t xml:space="preserve"> </w:t>
-      </w:r>
-      <w:r>
-        <w:rPr>
-          <w:rFonts w:ascii="Futura Book" w:hAnsi="Futura Book"/>
-          <w:b/>
-          <w:bCs/>
-        </w:rPr>
-        <w:t>Int</w:t>
-      </w:r>
-      <w:r>
-        <w:rPr>
-          <w:rFonts w:ascii="Futura Book" w:hAnsi="Futura Book"/>
-        </w:rPr>
-        <w:t xml:space="preserve"> </w:t>
-      </w:r>
-      <w:r>
-        <w:rPr>
-          <w:rFonts w:ascii="Futura Book" w:hAnsi="Futura Book"/>
-          <w:i/>
-          <w:iCs/>
-        </w:rPr>
-        <w:t>(String + Int)</w:t>
-      </w:r>
-      <w:r>
-        <w:rPr>
-          <w:rFonts w:ascii="Futura Book" w:hAnsi="Futura Book"/>
-        </w:rPr>
-        <w:t xml:space="preserve"> </w:t>
-      </w:r>
-      <w:r>
-        <w:rPr>
-          <w:rFonts w:ascii="Futura Book" w:hAnsi="Futura Book"/>
-          <w:b/>
-          <w:bCs/>
-        </w:rPr>
-        <w:t>Cross Fade Duration</w:t>
-      </w:r>
-      <w:r>
-        <w:rPr>
-          <w:rFonts w:ascii="Futura Book" w:hAnsi="Futura Book"/>
-        </w:rPr>
-        <w:t xml:space="preserve"> </w:t>
-      </w:r>
-      <w:r>
-        <w:rPr>
-          <w:rFonts w:ascii="Futura Book" w:hAnsi="Futura Book"/>
-          <w:i/>
-          <w:iCs/>
-        </w:rPr>
-        <w:t>(Float)</w:t>
       </w:r>
     </w:p>
     <w:p>
@@ -5177,7 +3632,7 @@
           <w:b/>
           <w:bCs/>
         </w:rPr>
-        <w:t>Swap Sprite</w:t>
+        <w:t>Swap Sprite - Changes the boss SpriteRenderer to a selected sprite.</w:t>
       </w:r>
       <w:r>
         <w:rPr>
@@ -5191,35 +3646,7 @@
         <w:rPr>
           <w:rFonts w:ascii="Futura Book" w:hAnsi="Futura Book"/>
         </w:rPr>
-        <w:t>Changes the boss sprite.</w:t>
-      </w:r>
-      <w:r>
-        <w:rPr>
-          <w:rFonts w:ascii="Futura Book" w:hAnsi="Futura Book"/>
-        </w:rPr>
         <w:br/>
-      </w:r>
-      <w:r>
-        <w:rPr>
-          <w:rFonts w:ascii="Futura Book" w:hAnsi="Futura Book"/>
-          <w:b/>
-          <w:bCs/>
-        </w:rPr>
-        <w:t>Sprite</w:t>
-      </w:r>
-      <w:r>
-        <w:rPr>
-          <w:rFonts w:ascii="Futura Book" w:hAnsi="Futura Book"/>
-        </w:rPr>
-        <w:t xml:space="preserve"> </w:t>
-      </w:r>
-      <w:r>
-        <w:rPr>
-          <w:rFonts w:ascii="Futura Book" w:hAnsi="Futura Book"/>
-          <w:i/>
-          <w:iCs/>
-        </w:rPr>
-        <w:t>(Sprite)</w:t>
       </w:r>
     </w:p>
     <w:p>
@@ -5237,6 +3664,7 @@
           <w:sz w:val="18"/>
           <w:szCs w:val="18"/>
         </w:rPr>
+        <w:lastRenderedPageBreak/>
         <w:drawing>
           <wp:anchor distT="0" distB="0" distL="114300" distR="114300" simplePos="0" relativeHeight="251715584" behindDoc="0" locked="0" layoutInCell="1" allowOverlap="1" wp14:anchorId="074C6AC7" wp14:editId="0565E13E">
             <wp:simplePos x="0" y="0"/>
@@ -5346,7 +3774,7 @@
           <w:b/>
           <w:bCs/>
         </w:rPr>
-        <w:t>Phase</w:t>
+        <w:t>Phase - Checks whether the boss health percentage is inside a configured range.</w:t>
       </w:r>
       <w:r>
         <w:rPr>
@@ -5360,69 +3788,13 @@
         <w:rPr>
           <w:rFonts w:ascii="Futura Book" w:hAnsi="Futura Book"/>
         </w:rPr>
-        <w:t>Checks whether the boss health is within a range.</w:t>
-      </w:r>
-      <w:r>
-        <w:rPr>
-          <w:rFonts w:ascii="Futura Book" w:hAnsi="Futura Book"/>
-        </w:rPr>
         <w:br/>
       </w:r>
       <w:r>
         <w:rPr>
           <w:rFonts w:ascii="Futura Book" w:hAnsi="Futura Book"/>
-          <w:b/>
-          <w:bCs/>
-        </w:rPr>
-        <w:t>Minimum Health %</w:t>
-      </w:r>
-      <w:r>
-        <w:rPr>
-          <w:rFonts w:ascii="Futura Book" w:hAnsi="Futura Book"/>
-        </w:rPr>
-        <w:t xml:space="preserve"> </w:t>
-      </w:r>
-      <w:r>
-        <w:rPr>
-          <w:rFonts w:ascii="Futura Book" w:hAnsi="Futura Book"/>
-          <w:i/>
-          <w:iCs/>
-        </w:rPr>
-        <w:t>(Float)</w:t>
-      </w:r>
-      <w:r>
-        <w:rPr>
-          <w:rFonts w:ascii="Futura Book" w:hAnsi="Futura Book"/>
-        </w:rPr>
-        <w:t xml:space="preserve"> </w:t>
-      </w:r>
-      <w:r>
-        <w:rPr>
-          <w:rFonts w:ascii="Futura Book" w:hAnsi="Futura Book"/>
         </w:rPr>
         <w:br/>
-      </w:r>
-      <w:r>
-        <w:rPr>
-          <w:rFonts w:ascii="Futura Book" w:hAnsi="Futura Book"/>
-          <w:b/>
-          <w:bCs/>
-        </w:rPr>
-        <w:t>Maximum Health %</w:t>
-      </w:r>
-      <w:r>
-        <w:rPr>
-          <w:rFonts w:ascii="Futura Book" w:hAnsi="Futura Book"/>
-        </w:rPr>
-        <w:t xml:space="preserve"> </w:t>
-      </w:r>
-      <w:r>
-        <w:rPr>
-          <w:rFonts w:ascii="Futura Book" w:hAnsi="Futura Book"/>
-          <w:i/>
-          <w:iCs/>
-        </w:rPr>
-        <w:t>(Float)</w:t>
       </w:r>
     </w:p>
     <w:p>
@@ -5440,7 +3812,6 @@
           <w:sz w:val="24"/>
           <w:szCs w:val="24"/>
         </w:rPr>
-        <w:lastRenderedPageBreak/>
         <w:drawing>
           <wp:anchor distT="0" distB="0" distL="114300" distR="114300" simplePos="0" relativeHeight="251717632" behindDoc="0" locked="0" layoutInCell="1" allowOverlap="1" wp14:anchorId="2F4236D6" wp14:editId="218E81E8">
             <wp:simplePos x="0" y="0"/>
@@ -5548,7 +3919,7 @@
           <w:b/>
           <w:bCs/>
         </w:rPr>
-        <w:t>Blackboard Compare</w:t>
+        <w:t>Blackboard Compare - Compares a Blackboard int or float value against a configured number.</w:t>
       </w:r>
       <w:r>
         <w:rPr>
@@ -5562,137 +3933,25 @@
         <w:rPr>
           <w:rFonts w:ascii="Futura Book" w:hAnsi="Futura Book"/>
         </w:rPr>
-        <w:t>Compares a Blackboard value.</w:t>
-      </w:r>
-      <w:r>
-        <w:rPr>
-          <w:rFonts w:ascii="Futura Book" w:hAnsi="Futura Book"/>
-        </w:rPr>
         <w:br/>
       </w:r>
       <w:r>
         <w:rPr>
           <w:rFonts w:ascii="Futura Book" w:hAnsi="Futura Book"/>
-          <w:b/>
-          <w:bCs/>
-        </w:rPr>
-        <w:t>Type</w:t>
-      </w:r>
-      <w:r>
-        <w:rPr>
-          <w:rFonts w:ascii="Futura Book" w:hAnsi="Futura Book"/>
-        </w:rPr>
-        <w:t xml:space="preserve"> </w:t>
-      </w:r>
-      <w:r>
-        <w:rPr>
-          <w:rFonts w:ascii="Futura Book" w:hAnsi="Futura Book"/>
-          <w:i/>
-          <w:iCs/>
-        </w:rPr>
-        <w:t>(Int / Float)</w:t>
-      </w:r>
-      <w:r>
-        <w:rPr>
-          <w:rFonts w:ascii="Futura Book" w:hAnsi="Futura Book"/>
-        </w:rPr>
-        <w:t xml:space="preserve"> </w:t>
-      </w:r>
-      <w:r>
-        <w:rPr>
-          <w:rFonts w:ascii="Futura Book" w:hAnsi="Futura Book"/>
         </w:rPr>
         <w:br/>
       </w:r>
       <w:r>
         <w:rPr>
           <w:rFonts w:ascii="Futura Book" w:hAnsi="Futura Book"/>
-          <w:b/>
-          <w:bCs/>
-        </w:rPr>
-        <w:t>Blackboard Key</w:t>
-      </w:r>
-      <w:r>
-        <w:rPr>
-          <w:rFonts w:ascii="Futura Book" w:hAnsi="Futura Book"/>
-        </w:rPr>
-        <w:t xml:space="preserve"> </w:t>
-      </w:r>
-      <w:r>
-        <w:rPr>
-          <w:rFonts w:ascii="Futura Book" w:hAnsi="Futura Book"/>
-          <w:i/>
-          <w:iCs/>
-        </w:rPr>
-        <w:t>(String)</w:t>
-      </w:r>
-      <w:r>
-        <w:rPr>
-          <w:rFonts w:ascii="Futura Book" w:hAnsi="Futura Book"/>
-        </w:rPr>
-        <w:t xml:space="preserve"> </w:t>
-      </w:r>
-      <w:r>
-        <w:rPr>
-          <w:rFonts w:ascii="Futura Book" w:hAnsi="Futura Book"/>
         </w:rPr>
         <w:br/>
       </w:r>
       <w:r>
         <w:rPr>
           <w:rFonts w:ascii="Futura Book" w:hAnsi="Futura Book"/>
-          <w:b/>
-          <w:bCs/>
-        </w:rPr>
-        <w:t>Comparison</w:t>
-      </w:r>
-      <w:r>
-        <w:rPr>
-          <w:rFonts w:ascii="Futura Book" w:hAnsi="Futura Book"/>
-        </w:rPr>
-        <w:t xml:space="preserve"> </w:t>
-      </w:r>
-      <w:r>
-        <w:rPr>
-          <w:rFonts w:ascii="Futura Book" w:hAnsi="Futura Book"/>
-          <w:i/>
-          <w:iCs/>
-        </w:rPr>
-        <w:t>(== / != / &lt; / &gt; / ≤ / ≥)</w:t>
-      </w:r>
-      <w:r>
-        <w:rPr>
-          <w:rFonts w:ascii="Futura Book" w:hAnsi="Futura Book"/>
-        </w:rPr>
-        <w:t xml:space="preserve"> </w:t>
-      </w:r>
-      <w:r>
-        <w:rPr>
-          <w:rFonts w:ascii="Futura Book" w:hAnsi="Futura Book"/>
         </w:rPr>
         <w:br/>
-      </w:r>
-      <w:r>
-        <w:rPr>
-          <w:rFonts w:ascii="Futura Book" w:hAnsi="Futura Book"/>
-          <w:b/>
-          <w:bCs/>
-        </w:rPr>
-        <w:t>Value</w:t>
-      </w:r>
-      <w:r>
-        <w:rPr>
-          <w:rFonts w:ascii="Futura Book" w:hAnsi="Futura Book"/>
-        </w:rPr>
-        <w:t xml:space="preserve"> </w:t>
-      </w:r>
-      <w:r>
-        <w:rPr>
-          <w:rFonts w:ascii="Futura Book" w:hAnsi="Futura Book"/>
-          <w:i/>
-          <w:iCs/>
-        </w:rPr>
-        <w:t>(Int / Float)</w:t>
       </w:r>
     </w:p>
     <w:p>
@@ -5812,7 +4071,7 @@
           <w:b/>
           <w:bCs/>
         </w:rPr>
-        <w:t>Blackboard Math</w:t>
+        <w:t>Blackboard Math - Updates a Blackboard int or float value using Set, Add, Subtract, Multiply, or Divide.</w:t>
       </w:r>
       <w:r>
         <w:rPr>
@@ -5826,132 +4085,20 @@
         <w:rPr>
           <w:rFonts w:ascii="Futura Book" w:hAnsi="Futura Book"/>
         </w:rPr>
-        <w:t>Performs math on a Blackboard variable.</w:t>
-      </w:r>
-      <w:r>
-        <w:rPr>
-          <w:rFonts w:ascii="Futura Book" w:hAnsi="Futura Book"/>
-        </w:rPr>
         <w:br/>
       </w:r>
       <w:r>
         <w:rPr>
           <w:rFonts w:ascii="Futura Book" w:hAnsi="Futura Book"/>
-          <w:b/>
-          <w:bCs/>
-        </w:rPr>
-        <w:t>Operation</w:t>
-      </w:r>
-      <w:r>
-        <w:rPr>
-          <w:rFonts w:ascii="Futura Book" w:hAnsi="Futura Book"/>
-        </w:rPr>
-        <w:t xml:space="preserve"> </w:t>
-      </w:r>
-      <w:r>
-        <w:rPr>
-          <w:rFonts w:ascii="Futura Book" w:hAnsi="Futura Book"/>
-          <w:i/>
-          <w:iCs/>
-        </w:rPr>
-        <w:t>(Set / Add / Subtract / Multiply / Divide)</w:t>
-      </w:r>
-      <w:r>
-        <w:rPr>
-          <w:rFonts w:ascii="Futura Book" w:hAnsi="Futura Book"/>
-        </w:rPr>
-        <w:t xml:space="preserve"> </w:t>
-      </w:r>
-      <w:r>
-        <w:rPr>
-          <w:rFonts w:ascii="Futura Book" w:hAnsi="Futura Book"/>
-          <w:b/>
-          <w:bCs/>
-        </w:rPr>
-        <w:t>Type</w:t>
-      </w:r>
-      <w:r>
-        <w:rPr>
-          <w:rFonts w:ascii="Futura Book" w:hAnsi="Futura Book"/>
-        </w:rPr>
-        <w:t xml:space="preserve"> </w:t>
-      </w:r>
-      <w:r>
-        <w:rPr>
-          <w:rFonts w:ascii="Futura Book" w:hAnsi="Futura Book"/>
-          <w:i/>
-          <w:iCs/>
-        </w:rPr>
-        <w:t>(Int / Float)</w:t>
-      </w:r>
-      <w:r>
-        <w:rPr>
-          <w:rFonts w:ascii="Futura Book" w:hAnsi="Futura Book"/>
-        </w:rPr>
-        <w:t xml:space="preserve"> </w:t>
-      </w:r>
-      <w:r>
-        <w:rPr>
-          <w:rFonts w:ascii="Futura Book" w:hAnsi="Futura Book"/>
         </w:rPr>
         <w:br/>
       </w:r>
       <w:r>
         <w:rPr>
           <w:rFonts w:ascii="Futura Book" w:hAnsi="Futura Book"/>
-          <w:b/>
-          <w:bCs/>
-        </w:rPr>
-        <w:t>Blackboard Key</w:t>
-      </w:r>
-      <w:r>
-        <w:rPr>
-          <w:rFonts w:ascii="Futura Book" w:hAnsi="Futura Book"/>
-        </w:rPr>
-        <w:t xml:space="preserve"> </w:t>
-      </w:r>
-      <w:r>
-        <w:rPr>
-          <w:rFonts w:ascii="Futura Book" w:hAnsi="Futura Book"/>
-          <w:i/>
-          <w:iCs/>
-        </w:rPr>
-        <w:t>(String)</w:t>
-      </w:r>
-      <w:r>
-        <w:rPr>
-          <w:rFonts w:ascii="Futura Book" w:hAnsi="Futura Book"/>
-        </w:rPr>
-        <w:t xml:space="preserve"> </w:t>
-      </w:r>
-      <w:r>
-        <w:rPr>
-          <w:rFonts w:ascii="Futura Book" w:hAnsi="Futura Book"/>
         </w:rPr>
         <w:br/>
       </w:r>
-      <w:r>
-        <w:rPr>
-          <w:rFonts w:ascii="Futura Book" w:hAnsi="Futura Book"/>
-          <w:b/>
-          <w:bCs/>
-        </w:rPr>
-        <w:t>Operand</w:t>
-      </w:r>
-      <w:r>
-        <w:rPr>
-          <w:rFonts w:ascii="Futura Book" w:hAnsi="Futura Book"/>
-        </w:rPr>
-        <w:t xml:space="preserve"> </w:t>
-      </w:r>
-      <w:r>
-        <w:rPr>
-          <w:rFonts w:ascii="Futura Book" w:hAnsi="Futura Book"/>
-          <w:i/>
-          <w:iCs/>
-        </w:rPr>
-        <w:t>(Int / Float)</w:t>
-      </w:r>
     </w:p>
     <w:p>
       <w:pPr>
@@ -5987,106 +4134,22 @@
         <w:rPr>
           <w:rFonts w:ascii="Futura Book" w:hAnsi="Futura Book"/>
         </w:rPr>
-        <w:t>Generates a random value.</w:t>
-      </w:r>
-    </w:p>
-    <w:p>
-      <w:pPr>
-        <w:rPr>
-          <w:rFonts w:ascii="Futura Book" w:hAnsi="Futura Book"/>
-        </w:rPr>
-      </w:pPr>
-      <w:r>
-        <w:rPr>
-          <w:rFonts w:ascii="Futura Book" w:hAnsi="Futura Book"/>
-          <w:b/>
-          <w:bCs/>
-        </w:rPr>
-        <w:t xml:space="preserve"> </w:t>
-      </w:r>
-      <w:r>
-        <w:rPr>
-          <w:rFonts w:ascii="Futura Book" w:hAnsi="Futura Book"/>
-        </w:rPr>
-        <w:t xml:space="preserve"> </w:t>
-      </w:r>
-      <w:r>
-        <w:rPr>
-          <w:rFonts w:ascii="Futura Book" w:hAnsi="Futura Book"/>
-          <w:b/>
-          <w:bCs/>
-        </w:rPr>
-        <w:t>Type</w:t>
-      </w:r>
-      <w:r>
-        <w:rPr>
-          <w:rFonts w:ascii="Futura Book" w:hAnsi="Futura Book"/>
-        </w:rPr>
-        <w:t xml:space="preserve"> </w:t>
-      </w:r>
-      <w:r>
-        <w:rPr>
-          <w:rFonts w:ascii="Futura Book" w:hAnsi="Futura Book"/>
-          <w:i/>
-          <w:iCs/>
-        </w:rPr>
-        <w:t>(Int / Float)</w:t>
-      </w:r>
-      <w:r>
-        <w:rPr>
-          <w:rFonts w:ascii="Futura Book" w:hAnsi="Futura Book"/>
-        </w:rPr>
-        <w:t xml:space="preserve"> • </w:t>
-      </w:r>
-      <w:r>
-        <w:rPr>
-          <w:rFonts w:ascii="Futura Book" w:hAnsi="Futura Book"/>
-          <w:b/>
-          <w:bCs/>
-        </w:rPr>
-        <w:t>Minimum</w:t>
-      </w:r>
-      <w:r>
-        <w:rPr>
-          <w:rFonts w:ascii="Futura Book" w:hAnsi="Futura Book"/>
-        </w:rPr>
-        <w:t xml:space="preserve"> </w:t>
-      </w:r>
-      <w:r>
-        <w:rPr>
-          <w:rFonts w:ascii="Futura Book" w:hAnsi="Futura Book"/>
-          <w:i/>
-          <w:iCs/>
-        </w:rPr>
-        <w:t>(Int / Float)</w:t>
-      </w:r>
-      <w:r>
-        <w:rPr>
-          <w:rFonts w:ascii="Futura Book" w:hAnsi="Futura Book"/>
-        </w:rPr>
-        <w:t xml:space="preserve"> • </w:t>
-      </w:r>
-      <w:r>
-        <w:rPr>
-          <w:rFonts w:ascii="Futura Book" w:hAnsi="Futura Book"/>
-          <w:b/>
-          <w:bCs/>
-        </w:rPr>
-        <w:t>Maximum</w:t>
-      </w:r>
-      <w:r>
-        <w:rPr>
-          <w:rFonts w:ascii="Futura Book" w:hAnsi="Futura Book"/>
-        </w:rPr>
-        <w:t xml:space="preserve"> </w:t>
-      </w:r>
-      <w:r>
-        <w:rPr>
-          <w:rFonts w:ascii="Futura Book" w:hAnsi="Futura Book"/>
-          <w:i/>
-          <w:iCs/>
-        </w:rPr>
-        <w:t>(Int / Float)</w:t>
+        <w:t>Generates a random int or float value for other nodes to use.</w:t>
+      </w:r>
+    </w:p>
+    <w:p>
+      <w:pPr>
+        <w:rPr>
+          <w:rFonts w:ascii="Futura Book" w:hAnsi="Futura Book"/>
+        </w:rPr>
+      </w:pPr>
+      <w:r>
+        <w:rPr>
+          <w:rFonts w:ascii="Futura Book" w:hAnsi="Futura Book"/>
+          <w:b/>
+          <w:bCs/>
+        </w:rPr>
+        <w:t>Type: Int or Float - Minimum: Int or Float - Maximum: Int or Float</w:t>
       </w:r>
     </w:p>
     <w:p>

</xml_diff>